<commit_message>
feature:the backend was dockerized
</commit_message>
<xml_diff>
--- a/04-week/02-session/02-activity/Documentos/Manual_DevOps_CI_CD_Docker.docx
+++ b/04-week/02-session/02-activity/Documentos/Manual_DevOps_CI_CD_Docker.docx
@@ -27,13 +27,7 @@
         <w:rPr>
           <w:lang w:val="es-CO"/>
         </w:rPr>
-        <w:t xml:space="preserve">1. </w:t>
-      </w:r>
-      <w:r>
-        <w:rPr>
-          <w:lang w:val="es-CO"/>
-        </w:rPr>
-        <w:t>Configuración del Pipeline CI/CD</w:t>
+        <w:t>1. Configuración del Pipeline CI/CD</w:t>
       </w:r>
     </w:p>
     <w:p>
@@ -75,7 +69,27 @@
         <w:rPr>
           <w:lang w:val="es-CO"/>
         </w:rPr>
-        <w:t xml:space="preserve">e ejecuto desde visual </w:t>
+        <w:t>e ejecuto</w:t>
+      </w:r>
+      <w:r>
+        <w:rPr>
+          <w:lang w:val="es-CO"/>
+        </w:rPr>
+        <w:t xml:space="preserve"> el Docker-</w:t>
+      </w:r>
+      <w:proofErr w:type="spellStart"/>
+      <w:r>
+        <w:rPr>
+          <w:lang w:val="es-CO"/>
+        </w:rPr>
+        <w:t>compose</w:t>
+      </w:r>
+      <w:proofErr w:type="spellEnd"/>
+      <w:r>
+        <w:rPr>
+          <w:lang w:val="es-CO"/>
+        </w:rPr>
+        <w:t xml:space="preserve"> desde visual </w:t>
       </w:r>
       <w:proofErr w:type="spellStart"/>
       <w:r>
@@ -119,11 +133,12 @@
         <w:rPr>
           <w:b/>
           <w:bCs/>
+          <w:noProof/>
           <w:lang w:val="es-CO"/>
         </w:rPr>
         <w:drawing>
-          <wp:inline distT="0" distB="0" distL="0" distR="0" wp14:anchorId="0A8CE8B1" wp14:editId="0C69E90B">
-            <wp:extent cx="5486400" cy="3662045"/>
+          <wp:inline distT="0" distB="0" distL="0" distR="0" wp14:anchorId="55521358" wp14:editId="1897E067">
+            <wp:extent cx="5486400" cy="4611370"/>
             <wp:effectExtent l="0" t="0" r="0" b="0"/>
             <wp:docPr id="1" name="Imagen 1"/>
             <wp:cNvGraphicFramePr>
@@ -145,7 +160,7 @@
                   <pic:spPr>
                     <a:xfrm>
                       <a:off x="0" y="0"/>
-                      <a:ext cx="5486400" cy="3662045"/>
+                      <a:ext cx="5486400" cy="4611370"/>
                     </a:xfrm>
                     <a:prstGeom prst="rect">
                       <a:avLst/>
@@ -167,37 +182,19 @@
           <w:lang w:val="es-CO"/>
         </w:rPr>
       </w:pPr>
-    </w:p>
-    <w:p>
-      <w:pPr>
-        <w:pStyle w:val="Prrafodelista"/>
+      <w:r>
         <w:rPr>
           <w:b/>
           <w:bCs/>
-          <w:lang w:val="es-CO"/>
-        </w:rPr>
-      </w:pPr>
-    </w:p>
-    <w:p>
-      <w:pPr>
-        <w:pStyle w:val="Prrafodelista"/>
-        <w:rPr>
-          <w:b/>
-          <w:bCs/>
-          <w:lang w:val="es-CO"/>
-        </w:rPr>
-      </w:pPr>
-      <w:r>
-        <w:rPr>
-          <w:b/>
-          <w:bCs/>
-          <w:lang w:val="es-CO"/>
-        </w:rPr>
+          <w:noProof/>
+          <w:lang w:val="es-CO"/>
+        </w:rPr>
+        <w:lastRenderedPageBreak/>
         <w:drawing>
-          <wp:inline distT="0" distB="0" distL="0" distR="0" wp14:anchorId="4C827764" wp14:editId="1DE62BDB">
-            <wp:extent cx="5486400" cy="1605915"/>
+          <wp:inline distT="0" distB="0" distL="0" distR="0" wp14:anchorId="3CF009C9" wp14:editId="56124994">
+            <wp:extent cx="5486400" cy="4135120"/>
             <wp:effectExtent l="0" t="0" r="0" b="0"/>
-            <wp:docPr id="3" name="Imagen 3"/>
+            <wp:docPr id="11" name="Imagen 11"/>
             <wp:cNvGraphicFramePr>
               <a:graphicFrameLocks xmlns:a="http://schemas.openxmlformats.org/drawingml/2006/main" noChangeAspect="1"/>
             </wp:cNvGraphicFramePr>
@@ -217,7 +214,7 @@
                   <pic:spPr>
                     <a:xfrm>
                       <a:off x="0" y="0"/>
-                      <a:ext cx="5486400" cy="1605915"/>
+                      <a:ext cx="5486400" cy="4135120"/>
                     </a:xfrm>
                     <a:prstGeom prst="rect">
                       <a:avLst/>
@@ -249,137 +246,18 @@
           <w:lang w:val="es-CO"/>
         </w:rPr>
       </w:pPr>
-    </w:p>
-    <w:p>
-      <w:pPr>
-        <w:pStyle w:val="Prrafodelista"/>
+      <w:r>
         <w:rPr>
           <w:b/>
           <w:bCs/>
-          <w:lang w:val="es-CO"/>
-        </w:rPr>
-      </w:pPr>
-    </w:p>
-    <w:p>
-      <w:pPr>
-        <w:pStyle w:val="Prrafodelista"/>
-        <w:rPr>
-          <w:b/>
-          <w:bCs/>
-          <w:lang w:val="es-CO"/>
-        </w:rPr>
-      </w:pPr>
-    </w:p>
-    <w:p>
-      <w:pPr>
-        <w:pStyle w:val="Prrafodelista"/>
-        <w:rPr>
-          <w:b/>
-          <w:bCs/>
-          <w:lang w:val="es-CO"/>
-        </w:rPr>
-      </w:pPr>
-    </w:p>
-    <w:p>
-      <w:pPr>
-        <w:pStyle w:val="Prrafodelista"/>
-        <w:rPr>
-          <w:b/>
-          <w:bCs/>
-          <w:lang w:val="es-CO"/>
-        </w:rPr>
-      </w:pPr>
-    </w:p>
-    <w:p>
-      <w:pPr>
-        <w:pStyle w:val="Prrafodelista"/>
-        <w:rPr>
-          <w:b/>
-          <w:bCs/>
-          <w:lang w:val="es-CO"/>
-        </w:rPr>
-      </w:pPr>
-    </w:p>
-    <w:p>
-      <w:pPr>
-        <w:pStyle w:val="Prrafodelista"/>
-        <w:rPr>
-          <w:b/>
-          <w:bCs/>
-          <w:lang w:val="es-CO"/>
-        </w:rPr>
-      </w:pPr>
-    </w:p>
-    <w:p>
-      <w:pPr>
-        <w:pStyle w:val="Prrafodelista"/>
-        <w:rPr>
-          <w:b/>
-          <w:bCs/>
-          <w:lang w:val="es-CO"/>
-        </w:rPr>
-      </w:pPr>
-    </w:p>
-    <w:p>
-      <w:pPr>
-        <w:pStyle w:val="Prrafodelista"/>
-        <w:numPr>
-          <w:ilvl w:val="0"/>
-          <w:numId w:val="13"/>
-        </w:numPr>
-        <w:rPr>
-          <w:b/>
-          <w:bCs/>
-          <w:lang w:val="es-CO"/>
-        </w:rPr>
-      </w:pPr>
-      <w:r>
-        <w:rPr>
-          <w:b/>
-          <w:bCs/>
-          <w:lang w:val="es-CO"/>
-        </w:rPr>
-        <w:t>CD:</w:t>
-      </w:r>
-    </w:p>
-    <w:p>
-      <w:pPr>
-        <w:pStyle w:val="Prrafodelista"/>
-        <w:rPr>
-          <w:b/>
-          <w:bCs/>
-          <w:lang w:val="es-CO"/>
-        </w:rPr>
-      </w:pPr>
-      <w:proofErr w:type="spellStart"/>
-      <w:r>
-        <w:rPr>
-          <w:b/>
-          <w:bCs/>
-          <w:lang w:val="es-CO"/>
-        </w:rPr>
-        <w:t>Dockerfile</w:t>
-      </w:r>
-      <w:proofErr w:type="spellEnd"/>
-    </w:p>
-    <w:p>
-      <w:pPr>
-        <w:pStyle w:val="Prrafodelista"/>
-        <w:rPr>
-          <w:b/>
-          <w:bCs/>
-          <w:lang w:val="es-CO"/>
-        </w:rPr>
-      </w:pPr>
-      <w:r>
-        <w:rPr>
+          <w:noProof/>
           <w:lang w:val="es-CO"/>
         </w:rPr>
         <w:drawing>
-          <wp:inline distT="0" distB="0" distL="0" distR="0" wp14:anchorId="681CD886" wp14:editId="662C00A8">
-            <wp:extent cx="5486400" cy="1490980"/>
+          <wp:inline distT="0" distB="0" distL="0" distR="0" wp14:anchorId="4C827764" wp14:editId="1DE62BDB">
+            <wp:extent cx="5486400" cy="1605915"/>
             <wp:effectExtent l="0" t="0" r="0" b="0"/>
-            <wp:docPr id="4" name="Imagen 4"/>
+            <wp:docPr id="3" name="Imagen 3"/>
             <wp:cNvGraphicFramePr>
               <a:graphicFrameLocks xmlns:a="http://schemas.openxmlformats.org/drawingml/2006/main" noChangeAspect="1"/>
             </wp:cNvGraphicFramePr>
@@ -399,7 +277,7 @@
                   <pic:spPr>
                     <a:xfrm>
                       <a:off x="0" y="0"/>
-                      <a:ext cx="5486400" cy="1490980"/>
+                      <a:ext cx="5486400" cy="1605915"/>
                     </a:xfrm>
                     <a:prstGeom prst="rect">
                       <a:avLst/>
@@ -421,22 +299,126 @@
           <w:lang w:val="es-CO"/>
         </w:rPr>
       </w:pPr>
-      <w:r>
+    </w:p>
+    <w:p>
+      <w:pPr>
+        <w:pStyle w:val="Prrafodelista"/>
         <w:rPr>
           <w:b/>
           <w:bCs/>
           <w:lang w:val="es-CO"/>
         </w:rPr>
-        <w:t>Docker-</w:t>
-      </w:r>
-      <w:proofErr w:type="spellStart"/>
-      <w:r>
+      </w:pPr>
+    </w:p>
+    <w:p>
+      <w:pPr>
+        <w:pStyle w:val="Prrafodelista"/>
         <w:rPr>
           <w:b/>
           <w:bCs/>
           <w:lang w:val="es-CO"/>
         </w:rPr>
-        <w:t>compose</w:t>
+      </w:pPr>
+    </w:p>
+    <w:p>
+      <w:pPr>
+        <w:pStyle w:val="Prrafodelista"/>
+        <w:rPr>
+          <w:b/>
+          <w:bCs/>
+          <w:lang w:val="es-CO"/>
+        </w:rPr>
+      </w:pPr>
+    </w:p>
+    <w:p>
+      <w:pPr>
+        <w:pStyle w:val="Prrafodelista"/>
+        <w:rPr>
+          <w:b/>
+          <w:bCs/>
+          <w:lang w:val="es-CO"/>
+        </w:rPr>
+      </w:pPr>
+    </w:p>
+    <w:p>
+      <w:pPr>
+        <w:pStyle w:val="Prrafodelista"/>
+        <w:rPr>
+          <w:b/>
+          <w:bCs/>
+          <w:lang w:val="es-CO"/>
+        </w:rPr>
+      </w:pPr>
+    </w:p>
+    <w:p>
+      <w:pPr>
+        <w:pStyle w:val="Prrafodelista"/>
+        <w:rPr>
+          <w:b/>
+          <w:bCs/>
+          <w:lang w:val="es-CO"/>
+        </w:rPr>
+      </w:pPr>
+    </w:p>
+    <w:p>
+      <w:pPr>
+        <w:pStyle w:val="Prrafodelista"/>
+        <w:rPr>
+          <w:b/>
+          <w:bCs/>
+          <w:lang w:val="es-CO"/>
+        </w:rPr>
+      </w:pPr>
+    </w:p>
+    <w:p>
+      <w:pPr>
+        <w:pStyle w:val="Prrafodelista"/>
+        <w:rPr>
+          <w:b/>
+          <w:bCs/>
+          <w:lang w:val="es-CO"/>
+        </w:rPr>
+      </w:pPr>
+    </w:p>
+    <w:p>
+      <w:pPr>
+        <w:pStyle w:val="Prrafodelista"/>
+        <w:numPr>
+          <w:ilvl w:val="0"/>
+          <w:numId w:val="13"/>
+        </w:numPr>
+        <w:rPr>
+          <w:b/>
+          <w:bCs/>
+          <w:lang w:val="es-CO"/>
+        </w:rPr>
+      </w:pPr>
+      <w:r>
+        <w:rPr>
+          <w:b/>
+          <w:bCs/>
+          <w:lang w:val="es-CO"/>
+        </w:rPr>
+        <w:t>CD:</w:t>
+      </w:r>
+    </w:p>
+    <w:p>
+      <w:pPr>
+        <w:pStyle w:val="Prrafodelista"/>
+        <w:rPr>
+          <w:b/>
+          <w:bCs/>
+          <w:lang w:val="es-CO"/>
+        </w:rPr>
+      </w:pPr>
+      <w:proofErr w:type="spellStart"/>
+      <w:r>
+        <w:rPr>
+          <w:b/>
+          <w:bCs/>
+          <w:lang w:val="es-CO"/>
+        </w:rPr>
+        <w:t>Dockerfile</w:t>
       </w:r>
       <w:proofErr w:type="spellEnd"/>
     </w:p>
@@ -451,15 +433,15 @@
       </w:pPr>
       <w:r>
         <w:rPr>
-          <w:b/>
-          <w:bCs/>
-          <w:lang w:val="es-CO"/>
-        </w:rPr>
+          <w:noProof/>
+          <w:lang w:val="es-CO"/>
+        </w:rPr>
+        <w:lastRenderedPageBreak/>
         <w:drawing>
-          <wp:inline distT="0" distB="0" distL="0" distR="0" wp14:anchorId="649FE108" wp14:editId="0AFF9E0D">
-            <wp:extent cx="5486400" cy="3515360"/>
-            <wp:effectExtent l="0" t="0" r="0" b="8890"/>
-            <wp:docPr id="2" name="Imagen 2"/>
+          <wp:inline distT="0" distB="0" distL="0" distR="0" wp14:anchorId="681CD886" wp14:editId="662C00A8">
+            <wp:extent cx="5486400" cy="1490980"/>
+            <wp:effectExtent l="0" t="0" r="0" b="0"/>
+            <wp:docPr id="4" name="Imagen 4"/>
             <wp:cNvGraphicFramePr>
               <a:graphicFrameLocks xmlns:a="http://schemas.openxmlformats.org/drawingml/2006/main" noChangeAspect="1"/>
             </wp:cNvGraphicFramePr>
@@ -479,7 +461,7 @@
                   <pic:spPr>
                     <a:xfrm>
                       <a:off x="0" y="0"/>
-                      <a:ext cx="5486400" cy="3515360"/>
+                      <a:ext cx="5486400" cy="1490980"/>
                     </a:xfrm>
                     <a:prstGeom prst="rect">
                       <a:avLst/>
@@ -494,698 +476,53 @@
     </w:p>
     <w:p>
       <w:pPr>
-        <w:rPr>
-          <w:lang w:val="es-CO"/>
-        </w:rPr>
-      </w:pPr>
-    </w:p>
-    <w:p>
-      <w:pPr>
-        <w:pStyle w:val="Ttulo1"/>
-        <w:rPr>
-          <w:lang w:val="es-CO"/>
-        </w:rPr>
-      </w:pPr>
-      <w:r>
-        <w:rPr>
-          <w:lang w:val="es-CO"/>
-        </w:rPr>
-        <w:t>2</w:t>
-      </w:r>
-      <w:r>
-        <w:rPr>
-          <w:lang w:val="es-CO"/>
-        </w:rPr>
-        <w:t xml:space="preserve">. </w:t>
-      </w:r>
-      <w:bookmarkStart w:id="0" w:name="_Hlk208338801"/>
+        <w:pStyle w:val="Prrafodelista"/>
+        <w:rPr>
+          <w:b/>
+          <w:bCs/>
+          <w:lang w:val="es-CO"/>
+        </w:rPr>
+      </w:pPr>
+      <w:r>
+        <w:rPr>
+          <w:b/>
+          <w:bCs/>
+          <w:lang w:val="es-CO"/>
+        </w:rPr>
+        <w:t>Docker-</w:t>
+      </w:r>
       <w:proofErr w:type="spellStart"/>
       <w:r>
         <w:rPr>
-          <w:lang w:val="es-CO"/>
-        </w:rPr>
-        <w:t>Dockerización</w:t>
-      </w:r>
-      <w:proofErr w:type="spellEnd"/>
-      <w:r>
-        <w:rPr>
-          <w:lang w:val="es-CO"/>
-        </w:rPr>
-        <w:t xml:space="preserve"> del </w:t>
-      </w:r>
-      <w:proofErr w:type="spellStart"/>
-      <w:r>
-        <w:rPr>
-          <w:lang w:val="es-CO"/>
-        </w:rPr>
-        <w:t>Backend</w:t>
-      </w:r>
-      <w:bookmarkEnd w:id="0"/>
+          <w:b/>
+          <w:bCs/>
+          <w:lang w:val="es-CO"/>
+        </w:rPr>
+        <w:t>compose</w:t>
+      </w:r>
       <w:proofErr w:type="spellEnd"/>
     </w:p>
     <w:p>
-      <w:r>
-        <w:rPr>
-          <w:lang w:val="es-CO"/>
-        </w:rPr>
-        <w:t xml:space="preserve">Para poder </w:t>
-      </w:r>
-      <w:proofErr w:type="spellStart"/>
-      <w:r>
-        <w:rPr>
-          <w:lang w:val="es-CO"/>
-        </w:rPr>
-        <w:t>dockerizarlo</w:t>
-      </w:r>
-      <w:proofErr w:type="spellEnd"/>
-      <w:r>
-        <w:rPr>
-          <w:lang w:val="es-CO"/>
-        </w:rPr>
-        <w:t>, se necesitó tener 2 documentos llamados Docker-</w:t>
-      </w:r>
-      <w:proofErr w:type="spellStart"/>
-      <w:r>
-        <w:rPr>
-          <w:lang w:val="es-CO"/>
-        </w:rPr>
-        <w:t>compose.yml</w:t>
-      </w:r>
-      <w:proofErr w:type="spellEnd"/>
-      <w:r>
-        <w:rPr>
-          <w:lang w:val="es-CO"/>
-        </w:rPr>
-        <w:t xml:space="preserve"> y el documento </w:t>
-      </w:r>
-      <w:proofErr w:type="spellStart"/>
-      <w:r>
-        <w:rPr>
-          <w:lang w:val="es-CO"/>
-        </w:rPr>
-        <w:t>Dockerfile</w:t>
-      </w:r>
-      <w:proofErr w:type="spellEnd"/>
-      <w:r>
-        <w:rPr>
-          <w:lang w:val="es-CO"/>
-        </w:rPr>
-        <w:t xml:space="preserve">. Comenzando hay que modificar el </w:t>
-      </w:r>
-      <w:proofErr w:type="spellStart"/>
-      <w:r>
-        <w:rPr>
-          <w:lang w:val="es-CO"/>
-        </w:rPr>
-        <w:t>Dockerfile</w:t>
-      </w:r>
-      <w:proofErr w:type="spellEnd"/>
-      <w:r>
-        <w:rPr>
-          <w:lang w:val="es-CO"/>
-        </w:rPr>
-        <w:t>, este d</w:t>
-      </w:r>
-      <w:proofErr w:type="spellStart"/>
-      <w:r>
-        <w:t>efine</w:t>
-      </w:r>
-      <w:proofErr w:type="spellEnd"/>
-      <w:r>
-        <w:t xml:space="preserve"> la variable de </w:t>
-      </w:r>
-      <w:proofErr w:type="spellStart"/>
-      <w:r>
-        <w:t>entorno</w:t>
-      </w:r>
-      <w:proofErr w:type="spellEnd"/>
-      <w:r>
-        <w:t xml:space="preserve"> </w:t>
-      </w:r>
-      <w:r>
-        <w:rPr>
-          <w:rStyle w:val="CdigoHTML"/>
-          <w:rFonts w:eastAsiaTheme="minorEastAsia"/>
-        </w:rPr>
-        <w:t>LANG</w:t>
-      </w:r>
-      <w:r>
-        <w:t xml:space="preserve"> para que </w:t>
-      </w:r>
-      <w:proofErr w:type="spellStart"/>
-      <w:r>
-        <w:t>todo</w:t>
-      </w:r>
-      <w:proofErr w:type="spellEnd"/>
-      <w:r>
-        <w:t xml:space="preserve"> </w:t>
-      </w:r>
-      <w:proofErr w:type="spellStart"/>
-      <w:r>
-        <w:t>dentro</w:t>
-      </w:r>
-      <w:proofErr w:type="spellEnd"/>
-      <w:r>
-        <w:t xml:space="preserve"> del </w:t>
-      </w:r>
-      <w:proofErr w:type="spellStart"/>
-      <w:r>
-        <w:t>contenedor</w:t>
-      </w:r>
-      <w:proofErr w:type="spellEnd"/>
-      <w:r>
-        <w:t xml:space="preserve"> use </w:t>
-      </w:r>
-      <w:proofErr w:type="spellStart"/>
-      <w:r>
-        <w:t>esa</w:t>
-      </w:r>
-      <w:proofErr w:type="spellEnd"/>
-      <w:r>
-        <w:t xml:space="preserve"> </w:t>
-      </w:r>
-      <w:proofErr w:type="spellStart"/>
-      <w:r>
-        <w:t>configuración</w:t>
-      </w:r>
-      <w:proofErr w:type="spellEnd"/>
-      <w:r>
-        <w:t>.</w:t>
-      </w:r>
-    </w:p>
-    <w:p>
-      <w:r>
-        <w:t>El document Docker-compose:</w:t>
-      </w:r>
-    </w:p>
-    <w:p>
-      <w:pPr>
-        <w:pStyle w:val="NormalWeb"/>
-        <w:numPr>
-          <w:ilvl w:val="0"/>
-          <w:numId w:val="10"/>
-        </w:numPr>
-      </w:pPr>
-      <w:r>
-        <w:rPr>
-          <w:rStyle w:val="Textoennegrita"/>
-        </w:rPr>
-        <w:lastRenderedPageBreak/>
-        <w:t>Levanta PostgreSQL</w:t>
-      </w:r>
-      <w:r>
-        <w:t xml:space="preserve"> usando el </w:t>
-      </w:r>
-      <w:proofErr w:type="spellStart"/>
-      <w:r>
-        <w:rPr>
-          <w:rStyle w:val="CdigoHTML"/>
-        </w:rPr>
-        <w:t>Dockerfile</w:t>
-      </w:r>
-      <w:proofErr w:type="spellEnd"/>
-      <w:r>
-        <w:t xml:space="preserve"> anterior.</w:t>
-      </w:r>
-    </w:p>
-    <w:p>
-      <w:pPr>
-        <w:pStyle w:val="NormalWeb"/>
-        <w:numPr>
-          <w:ilvl w:val="0"/>
-          <w:numId w:val="10"/>
-        </w:numPr>
-      </w:pPr>
-      <w:r>
-        <w:rPr>
-          <w:rStyle w:val="Textoennegrita"/>
-        </w:rPr>
-        <w:t>Configuraciones importantes</w:t>
-      </w:r>
-      <w:r>
-        <w:t>:</w:t>
-      </w:r>
-    </w:p>
-    <w:p>
-      <w:pPr>
-        <w:pStyle w:val="NormalWeb"/>
-        <w:numPr>
-          <w:ilvl w:val="2"/>
-          <w:numId w:val="10"/>
-        </w:numPr>
-      </w:pPr>
-      <w:r>
-        <w:rPr>
-          <w:rStyle w:val="CdigoHTML"/>
-        </w:rPr>
-        <w:t>POSTGRES_DB=</w:t>
-      </w:r>
-      <w:proofErr w:type="spellStart"/>
-      <w:r>
-        <w:rPr>
-          <w:rStyle w:val="CdigoHTML"/>
-        </w:rPr>
-        <w:t>flight_management</w:t>
-      </w:r>
-      <w:proofErr w:type="spellEnd"/>
-      <w:r>
-        <w:t xml:space="preserve"> → crea esa base al iniciar.</w:t>
-      </w:r>
-    </w:p>
-    <w:p>
-      <w:pPr>
-        <w:pStyle w:val="NormalWeb"/>
-        <w:numPr>
-          <w:ilvl w:val="2"/>
-          <w:numId w:val="10"/>
-        </w:numPr>
-      </w:pPr>
-      <w:r>
-        <w:rPr>
-          <w:rStyle w:val="CdigoHTML"/>
-        </w:rPr>
-        <w:t>POSTGRES_USER=</w:t>
-      </w:r>
-      <w:proofErr w:type="spellStart"/>
-      <w:r>
-        <w:rPr>
-          <w:rStyle w:val="CdigoHTML"/>
-        </w:rPr>
-        <w:t>postgres</w:t>
-      </w:r>
-      <w:proofErr w:type="spellEnd"/>
-      <w:r>
-        <w:t xml:space="preserve"> y </w:t>
-      </w:r>
-      <w:r>
-        <w:rPr>
-          <w:rStyle w:val="CdigoHTML"/>
-        </w:rPr>
-        <w:t>POSTGRES_PASSWORD=abcd1234</w:t>
-      </w:r>
-      <w:r>
-        <w:t xml:space="preserve"> → credenciales por defecto.</w:t>
-      </w:r>
-    </w:p>
-    <w:p>
-      <w:pPr>
-        <w:pStyle w:val="NormalWeb"/>
-        <w:numPr>
-          <w:ilvl w:val="2"/>
-          <w:numId w:val="10"/>
-        </w:numPr>
-      </w:pPr>
-      <w:proofErr w:type="spellStart"/>
-      <w:r>
-        <w:rPr>
-          <w:rStyle w:val="CdigoHTML"/>
-        </w:rPr>
-        <w:t>ports</w:t>
-      </w:r>
-      <w:proofErr w:type="spellEnd"/>
-      <w:r>
-        <w:rPr>
-          <w:rStyle w:val="CdigoHTML"/>
-        </w:rPr>
-        <w:t>: "5433:5432"</w:t>
-      </w:r>
-      <w:r>
-        <w:t xml:space="preserve"> → accedes desde tu máquina en el puerto </w:t>
-      </w:r>
-      <w:r>
-        <w:rPr>
-          <w:rStyle w:val="Textoennegrita"/>
-        </w:rPr>
-        <w:t>5433</w:t>
-      </w:r>
-      <w:r>
-        <w:t xml:space="preserve"> (el contenedor escucha en el </w:t>
-      </w:r>
-      <w:r>
-        <w:rPr>
-          <w:rStyle w:val="Textoennegrita"/>
-        </w:rPr>
-        <w:t>5432</w:t>
-      </w:r>
-      <w:r>
-        <w:t xml:space="preserve"> interno).</w:t>
-      </w:r>
-    </w:p>
-    <w:p>
-      <w:pPr>
-        <w:pStyle w:val="NormalWeb"/>
-        <w:numPr>
-          <w:ilvl w:val="2"/>
-          <w:numId w:val="10"/>
-        </w:numPr>
-      </w:pPr>
-      <w:proofErr w:type="spellStart"/>
-      <w:r>
-        <w:rPr>
-          <w:rStyle w:val="CdigoHTML"/>
-        </w:rPr>
-        <w:t>volumes</w:t>
-      </w:r>
-      <w:proofErr w:type="spellEnd"/>
-      <w:r>
-        <w:t>:</w:t>
-      </w:r>
-    </w:p>
-    <w:p>
-      <w:pPr>
-        <w:pStyle w:val="NormalWeb"/>
-        <w:numPr>
-          <w:ilvl w:val="2"/>
-          <w:numId w:val="10"/>
-        </w:numPr>
-      </w:pPr>
-      <w:proofErr w:type="spellStart"/>
-      <w:r>
-        <w:rPr>
-          <w:rStyle w:val="CdigoHTML"/>
-        </w:rPr>
-        <w:t>postgres_data</w:t>
-      </w:r>
-      <w:proofErr w:type="spellEnd"/>
-      <w:r>
-        <w:t xml:space="preserve"> → guarda los datos de la BD en tu host (persistencia).</w:t>
-      </w:r>
-    </w:p>
-    <w:p>
-      <w:pPr>
-        <w:pStyle w:val="NormalWeb"/>
-        <w:numPr>
-          <w:ilvl w:val="2"/>
-          <w:numId w:val="10"/>
-        </w:numPr>
-      </w:pPr>
-      <w:r>
-        <w:rPr>
-          <w:rStyle w:val="CdigoHTML"/>
-        </w:rPr>
-        <w:t>/home/</w:t>
-      </w:r>
-      <w:proofErr w:type="spellStart"/>
-      <w:r>
-        <w:rPr>
-          <w:rStyle w:val="CdigoHTML"/>
-        </w:rPr>
-        <w:t>ubuntu</w:t>
-      </w:r>
-      <w:proofErr w:type="spellEnd"/>
-      <w:r>
-        <w:rPr>
-          <w:rStyle w:val="CdigoHTML"/>
-        </w:rPr>
-        <w:t>/</w:t>
-      </w:r>
-      <w:proofErr w:type="spellStart"/>
-      <w:r>
-        <w:rPr>
-          <w:rStyle w:val="CdigoHTML"/>
-        </w:rPr>
-        <w:t>db_backups</w:t>
-      </w:r>
-      <w:proofErr w:type="spellEnd"/>
-      <w:r>
-        <w:rPr>
-          <w:rStyle w:val="CdigoHTML"/>
-        </w:rPr>
-        <w:t>:/</w:t>
-      </w:r>
-      <w:proofErr w:type="spellStart"/>
-      <w:r>
-        <w:rPr>
-          <w:rStyle w:val="CdigoHTML"/>
-        </w:rPr>
-        <w:t>backups</w:t>
-      </w:r>
-      <w:proofErr w:type="spellEnd"/>
-      <w:r>
-        <w:rPr>
-          <w:rStyle w:val="CdigoHTML"/>
-        </w:rPr>
-        <w:t>/</w:t>
-      </w:r>
-      <w:proofErr w:type="spellStart"/>
-      <w:r>
-        <w:rPr>
-          <w:rStyle w:val="CdigoHTML"/>
-        </w:rPr>
-        <w:t>postgres</w:t>
-      </w:r>
-      <w:proofErr w:type="spellEnd"/>
-      <w:r>
-        <w:t xml:space="preserve"> → carpeta para respaldos en tu servidor.</w:t>
-      </w:r>
-    </w:p>
-    <w:p>
-      <w:pPr>
-        <w:pStyle w:val="NormalWeb"/>
-        <w:numPr>
-          <w:ilvl w:val="2"/>
-          <w:numId w:val="10"/>
-        </w:numPr>
-      </w:pPr>
-      <w:proofErr w:type="spellStart"/>
-      <w:r>
-        <w:rPr>
-          <w:rStyle w:val="CdigoHTML"/>
-        </w:rPr>
-        <w:t>healthcheck</w:t>
-      </w:r>
-      <w:proofErr w:type="spellEnd"/>
-      <w:r>
-        <w:t xml:space="preserve"> → verifica que PostgreSQL esté corriendo antes de que otros servicios dependan de él.</w:t>
-      </w:r>
-    </w:p>
-    <w:p>
-      <w:pPr>
-        <w:pStyle w:val="NormalWeb"/>
-        <w:numPr>
-          <w:ilvl w:val="2"/>
-          <w:numId w:val="10"/>
-        </w:numPr>
-      </w:pPr>
-      <w:proofErr w:type="spellStart"/>
-      <w:r>
-        <w:rPr>
-          <w:rStyle w:val="CdigoHTML"/>
-          <w:rFonts w:eastAsiaTheme="minorEastAsia"/>
-        </w:rPr>
-        <w:t>labels</w:t>
-      </w:r>
-      <w:proofErr w:type="spellEnd"/>
-      <w:r>
-        <w:t xml:space="preserve"> → simple </w:t>
-      </w:r>
-      <w:proofErr w:type="spellStart"/>
-      <w:r>
-        <w:t>metadata</w:t>
-      </w:r>
-      <w:proofErr w:type="spellEnd"/>
-      <w:r>
-        <w:t xml:space="preserve"> para organizar.</w:t>
-      </w:r>
-    </w:p>
-    <w:p>
-      <w:pPr>
-        <w:pStyle w:val="Ttulo1"/>
-        <w:rPr>
-          <w:lang w:val="es-CO"/>
-        </w:rPr>
-      </w:pPr>
-      <w:r>
-        <w:rPr>
-          <w:lang w:val="es-CO"/>
-        </w:rPr>
-        <w:t>3. Guí</w:t>
-      </w:r>
-      <w:r>
-        <w:rPr>
-          <w:lang w:val="es-CO"/>
-        </w:rPr>
-        <w:t>a práctica de despliegue</w:t>
-      </w:r>
-    </w:p>
-    <w:p>
       <w:pPr>
         <w:pStyle w:val="Prrafodelista"/>
-        <w:numPr>
-          <w:ilvl w:val="0"/>
-          <w:numId w:val="14"/>
-        </w:numPr>
-        <w:rPr>
-          <w:lang w:val="es-CO"/>
-        </w:rPr>
-      </w:pPr>
-      <w:r>
-        <w:rPr>
-          <w:lang w:val="es-CO"/>
-        </w:rPr>
-        <w:t>Clonar el repositorio del mismo GitHub.</w:t>
-      </w:r>
-    </w:p>
-    <w:p>
-      <w:pPr>
-        <w:pStyle w:val="Prrafodelista"/>
-        <w:numPr>
-          <w:ilvl w:val="0"/>
-          <w:numId w:val="14"/>
-        </w:numPr>
-        <w:rPr>
-          <w:lang w:val="es-CO"/>
-        </w:rPr>
-      </w:pPr>
-      <w:r>
-        <w:rPr>
-          <w:lang w:val="es-CO"/>
-        </w:rPr>
-        <w:t>Tener instalado Docker y WSL.</w:t>
-      </w:r>
-    </w:p>
-    <w:p>
-      <w:pPr>
-        <w:pStyle w:val="Prrafodelista"/>
-        <w:numPr>
-          <w:ilvl w:val="0"/>
-          <w:numId w:val="14"/>
-        </w:numPr>
-        <w:rPr>
-          <w:lang w:val="es-CO"/>
-        </w:rPr>
-      </w:pPr>
-      <w:r>
-        <w:rPr>
-          <w:lang w:val="es-CO"/>
-        </w:rPr>
-        <w:t>Entrar a el editor Visual Studio Code.</w:t>
-      </w:r>
-    </w:p>
-    <w:p>
-      <w:pPr>
-        <w:pStyle w:val="Prrafodelista"/>
-        <w:numPr>
-          <w:ilvl w:val="0"/>
-          <w:numId w:val="14"/>
-        </w:numPr>
-        <w:rPr>
-          <w:lang w:val="es-CO"/>
-        </w:rPr>
-      </w:pPr>
-      <w:r>
-        <w:rPr>
-          <w:lang w:val="es-CO"/>
-        </w:rPr>
-        <w:t>Entrar desde el editor de código a la carpeta correspondiente.</w:t>
-      </w:r>
-    </w:p>
-    <w:p>
-      <w:pPr>
-        <w:pStyle w:val="Prrafodelista"/>
-        <w:numPr>
-          <w:ilvl w:val="0"/>
-          <w:numId w:val="14"/>
-        </w:numPr>
-        <w:rPr>
-          <w:lang w:val="es-CO"/>
-        </w:rPr>
-      </w:pPr>
-      <w:r>
-        <w:rPr>
-          <w:lang w:val="es-CO"/>
-        </w:rPr>
-        <w:t xml:space="preserve">Entrar a la carpeta </w:t>
-      </w:r>
-      <w:proofErr w:type="spellStart"/>
-      <w:r>
-        <w:rPr>
-          <w:lang w:val="es-CO"/>
-        </w:rPr>
-        <w:t>Postgres</w:t>
-      </w:r>
-      <w:proofErr w:type="spellEnd"/>
-      <w:r>
-        <w:rPr>
-          <w:lang w:val="es-CO"/>
-        </w:rPr>
-        <w:t xml:space="preserve"> alojada en la dirección week4-&gt;sesión 2-&gt;material-&gt;</w:t>
-      </w:r>
-      <w:proofErr w:type="spellStart"/>
-      <w:r>
-        <w:rPr>
-          <w:lang w:val="es-CO"/>
-        </w:rPr>
-        <w:t>architecture</w:t>
-      </w:r>
-      <w:proofErr w:type="spellEnd"/>
-      <w:r>
-        <w:rPr>
-          <w:lang w:val="es-CO"/>
-        </w:rPr>
-        <w:t>-&gt;</w:t>
-      </w:r>
-      <w:proofErr w:type="spellStart"/>
-      <w:r>
-        <w:rPr>
-          <w:lang w:val="es-CO"/>
-        </w:rPr>
-        <w:t>devop</w:t>
-      </w:r>
-      <w:proofErr w:type="spellEnd"/>
-      <w:r>
-        <w:rPr>
-          <w:lang w:val="es-CO"/>
-        </w:rPr>
-        <w:t>.</w:t>
-      </w:r>
-    </w:p>
-    <w:p>
-      <w:pPr>
-        <w:pStyle w:val="Prrafodelista"/>
-        <w:numPr>
-          <w:ilvl w:val="0"/>
-          <w:numId w:val="14"/>
-        </w:numPr>
-        <w:rPr>
-          <w:lang w:val="es-CO"/>
-        </w:rPr>
-      </w:pPr>
-      <w:r>
-        <w:rPr>
-          <w:lang w:val="es-CO"/>
-        </w:rPr>
-        <w:t>Ejecutar el archivo “Docker-</w:t>
-      </w:r>
-      <w:proofErr w:type="spellStart"/>
-      <w:r>
-        <w:rPr>
-          <w:lang w:val="es-CO"/>
-        </w:rPr>
-        <w:t>compose.yml</w:t>
-      </w:r>
-      <w:proofErr w:type="spellEnd"/>
-      <w:r>
-        <w:rPr>
-          <w:lang w:val="es-CO"/>
-        </w:rPr>
-        <w:t>” con la extensión:</w:t>
-      </w:r>
-      <w:r>
-        <w:rPr>
-          <w:lang w:val="es-CO"/>
-        </w:rPr>
-        <w:t xml:space="preserve"> </w:t>
-      </w:r>
-      <w:r>
-        <w:rPr>
+        <w:rPr>
+          <w:b/>
+          <w:bCs/>
+          <w:lang w:val="es-CO"/>
+        </w:rPr>
+      </w:pPr>
+      <w:r>
+        <w:rPr>
+          <w:b/>
+          <w:bCs/>
+          <w:noProof/>
           <w:lang w:val="es-CO"/>
         </w:rPr>
         <w:drawing>
-          <wp:inline distT="0" distB="0" distL="0" distR="0" wp14:anchorId="732BCFE6" wp14:editId="72D39E04">
-            <wp:extent cx="3696216" cy="847843"/>
-            <wp:effectExtent l="0" t="0" r="0" b="9525"/>
-            <wp:docPr id="5" name="Imagen 5"/>
+          <wp:inline distT="0" distB="0" distL="0" distR="0" wp14:anchorId="7A692A02" wp14:editId="3049F18B">
+            <wp:extent cx="5486400" cy="5866765"/>
+            <wp:effectExtent l="0" t="0" r="0" b="635"/>
+            <wp:docPr id="12" name="Imagen 12"/>
             <wp:cNvGraphicFramePr>
               <a:graphicFrameLocks xmlns:a="http://schemas.openxmlformats.org/drawingml/2006/main" noChangeAspect="1"/>
             </wp:cNvGraphicFramePr>
@@ -1205,6 +542,721 @@
                   <pic:spPr>
                     <a:xfrm>
                       <a:off x="0" y="0"/>
+                      <a:ext cx="5486400" cy="5866765"/>
+                    </a:xfrm>
+                    <a:prstGeom prst="rect">
+                      <a:avLst/>
+                    </a:prstGeom>
+                  </pic:spPr>
+                </pic:pic>
+              </a:graphicData>
+            </a:graphic>
+          </wp:inline>
+        </w:drawing>
+      </w:r>
+    </w:p>
+    <w:p>
+      <w:pPr>
+        <w:rPr>
+          <w:lang w:val="es-CO"/>
+        </w:rPr>
+      </w:pPr>
+    </w:p>
+    <w:p>
+      <w:pPr>
+        <w:pStyle w:val="Ttulo1"/>
+        <w:rPr>
+          <w:lang w:val="es-CO"/>
+        </w:rPr>
+      </w:pPr>
+      <w:r>
+        <w:rPr>
+          <w:lang w:val="es-CO"/>
+        </w:rPr>
+        <w:lastRenderedPageBreak/>
+        <w:t xml:space="preserve">2. </w:t>
+      </w:r>
+      <w:bookmarkStart w:id="0" w:name="_Hlk208338801"/>
+      <w:proofErr w:type="spellStart"/>
+      <w:r>
+        <w:rPr>
+          <w:lang w:val="es-CO"/>
+        </w:rPr>
+        <w:t>Dockerización</w:t>
+      </w:r>
+      <w:proofErr w:type="spellEnd"/>
+      <w:r>
+        <w:rPr>
+          <w:lang w:val="es-CO"/>
+        </w:rPr>
+        <w:t xml:space="preserve"> del </w:t>
+      </w:r>
+      <w:proofErr w:type="spellStart"/>
+      <w:r>
+        <w:rPr>
+          <w:lang w:val="es-CO"/>
+        </w:rPr>
+        <w:t>Backend</w:t>
+      </w:r>
+      <w:bookmarkEnd w:id="0"/>
+      <w:proofErr w:type="spellEnd"/>
+    </w:p>
+    <w:p>
+      <w:r>
+        <w:rPr>
+          <w:lang w:val="es-CO"/>
+        </w:rPr>
+        <w:t xml:space="preserve">Para poder </w:t>
+      </w:r>
+      <w:proofErr w:type="spellStart"/>
+      <w:r>
+        <w:rPr>
+          <w:lang w:val="es-CO"/>
+        </w:rPr>
+        <w:t>dockerizarlo</w:t>
+      </w:r>
+      <w:proofErr w:type="spellEnd"/>
+      <w:r>
+        <w:rPr>
+          <w:lang w:val="es-CO"/>
+        </w:rPr>
+        <w:t>, se necesitó tener 2 documentos llamados Docker-</w:t>
+      </w:r>
+      <w:proofErr w:type="spellStart"/>
+      <w:r>
+        <w:rPr>
+          <w:lang w:val="es-CO"/>
+        </w:rPr>
+        <w:t>compose.yml</w:t>
+      </w:r>
+      <w:proofErr w:type="spellEnd"/>
+      <w:r>
+        <w:rPr>
+          <w:lang w:val="es-CO"/>
+        </w:rPr>
+        <w:t xml:space="preserve"> y el documento </w:t>
+      </w:r>
+      <w:proofErr w:type="spellStart"/>
+      <w:r>
+        <w:rPr>
+          <w:lang w:val="es-CO"/>
+        </w:rPr>
+        <w:t>Dockerfile</w:t>
+      </w:r>
+      <w:proofErr w:type="spellEnd"/>
+      <w:r>
+        <w:rPr>
+          <w:lang w:val="es-CO"/>
+        </w:rPr>
+        <w:t xml:space="preserve">. Comenzando hay que modificar el </w:t>
+      </w:r>
+      <w:proofErr w:type="spellStart"/>
+      <w:r>
+        <w:rPr>
+          <w:lang w:val="es-CO"/>
+        </w:rPr>
+        <w:t>Dockerfile</w:t>
+      </w:r>
+      <w:proofErr w:type="spellEnd"/>
+      <w:r>
+        <w:rPr>
+          <w:lang w:val="es-CO"/>
+        </w:rPr>
+        <w:t>, este d</w:t>
+      </w:r>
+      <w:proofErr w:type="spellStart"/>
+      <w:r>
+        <w:t>efine</w:t>
+      </w:r>
+      <w:proofErr w:type="spellEnd"/>
+      <w:r>
+        <w:t xml:space="preserve"> la variable de </w:t>
+      </w:r>
+      <w:proofErr w:type="spellStart"/>
+      <w:r>
+        <w:t>entorno</w:t>
+      </w:r>
+      <w:proofErr w:type="spellEnd"/>
+      <w:r>
+        <w:t xml:space="preserve"> </w:t>
+      </w:r>
+      <w:r>
+        <w:rPr>
+          <w:rStyle w:val="CdigoHTML"/>
+          <w:rFonts w:eastAsiaTheme="minorEastAsia"/>
+        </w:rPr>
+        <w:t>LANG</w:t>
+      </w:r>
+      <w:r>
+        <w:t xml:space="preserve"> para que </w:t>
+      </w:r>
+      <w:proofErr w:type="spellStart"/>
+      <w:r>
+        <w:t>todo</w:t>
+      </w:r>
+      <w:proofErr w:type="spellEnd"/>
+      <w:r>
+        <w:t xml:space="preserve"> </w:t>
+      </w:r>
+      <w:proofErr w:type="spellStart"/>
+      <w:r>
+        <w:t>dentro</w:t>
+      </w:r>
+      <w:proofErr w:type="spellEnd"/>
+      <w:r>
+        <w:t xml:space="preserve"> del </w:t>
+      </w:r>
+      <w:proofErr w:type="spellStart"/>
+      <w:r>
+        <w:t>contenedor</w:t>
+      </w:r>
+      <w:proofErr w:type="spellEnd"/>
+      <w:r>
+        <w:t xml:space="preserve"> use </w:t>
+      </w:r>
+      <w:proofErr w:type="spellStart"/>
+      <w:r>
+        <w:t>esa</w:t>
+      </w:r>
+      <w:proofErr w:type="spellEnd"/>
+      <w:r>
+        <w:t xml:space="preserve"> </w:t>
+      </w:r>
+      <w:proofErr w:type="spellStart"/>
+      <w:r>
+        <w:t>configuración</w:t>
+      </w:r>
+      <w:proofErr w:type="spellEnd"/>
+      <w:r>
+        <w:t>.</w:t>
+      </w:r>
+    </w:p>
+    <w:p>
+      <w:r>
+        <w:t>El document Docker-compose:</w:t>
+      </w:r>
+    </w:p>
+    <w:p>
+      <w:pPr>
+        <w:pStyle w:val="NormalWeb"/>
+        <w:numPr>
+          <w:ilvl w:val="0"/>
+          <w:numId w:val="10"/>
+        </w:numPr>
+      </w:pPr>
+      <w:r>
+        <w:rPr>
+          <w:rStyle w:val="Textoennegrita"/>
+        </w:rPr>
+        <w:t>Levanta PostgreSQL</w:t>
+      </w:r>
+      <w:r>
+        <w:t xml:space="preserve"> usando el </w:t>
+      </w:r>
+      <w:proofErr w:type="spellStart"/>
+      <w:r>
+        <w:rPr>
+          <w:rStyle w:val="CdigoHTML"/>
+        </w:rPr>
+        <w:t>Dockerfile</w:t>
+      </w:r>
+      <w:proofErr w:type="spellEnd"/>
+      <w:r>
+        <w:t xml:space="preserve"> anterior.</w:t>
+      </w:r>
+    </w:p>
+    <w:p>
+      <w:pPr>
+        <w:pStyle w:val="NormalWeb"/>
+        <w:numPr>
+          <w:ilvl w:val="0"/>
+          <w:numId w:val="10"/>
+        </w:numPr>
+      </w:pPr>
+      <w:r>
+        <w:rPr>
+          <w:rStyle w:val="Textoennegrita"/>
+        </w:rPr>
+        <w:t>Configuraciones importantes</w:t>
+      </w:r>
+      <w:r>
+        <w:t>:</w:t>
+      </w:r>
+    </w:p>
+    <w:p>
+      <w:pPr>
+        <w:pStyle w:val="NormalWeb"/>
+        <w:numPr>
+          <w:ilvl w:val="2"/>
+          <w:numId w:val="10"/>
+        </w:numPr>
+      </w:pPr>
+      <w:r>
+        <w:rPr>
+          <w:rStyle w:val="CdigoHTML"/>
+        </w:rPr>
+        <w:t>POSTGRES_DB=</w:t>
+      </w:r>
+      <w:proofErr w:type="spellStart"/>
+      <w:r>
+        <w:rPr>
+          <w:rStyle w:val="CdigoHTML"/>
+        </w:rPr>
+        <w:t>flight_management</w:t>
+      </w:r>
+      <w:proofErr w:type="spellEnd"/>
+      <w:r>
+        <w:t xml:space="preserve"> → crea esa base al iniciar.</w:t>
+      </w:r>
+    </w:p>
+    <w:p>
+      <w:pPr>
+        <w:pStyle w:val="NormalWeb"/>
+        <w:numPr>
+          <w:ilvl w:val="2"/>
+          <w:numId w:val="10"/>
+        </w:numPr>
+      </w:pPr>
+      <w:r>
+        <w:rPr>
+          <w:rStyle w:val="CdigoHTML"/>
+        </w:rPr>
+        <w:t>POSTGRES_USER=</w:t>
+      </w:r>
+      <w:proofErr w:type="spellStart"/>
+      <w:r>
+        <w:rPr>
+          <w:rStyle w:val="CdigoHTML"/>
+        </w:rPr>
+        <w:t>postgres</w:t>
+      </w:r>
+      <w:proofErr w:type="spellEnd"/>
+      <w:r>
+        <w:t xml:space="preserve"> y </w:t>
+      </w:r>
+      <w:r>
+        <w:rPr>
+          <w:rStyle w:val="CdigoHTML"/>
+        </w:rPr>
+        <w:t>POSTGRES_PASSWORD=abcd1234</w:t>
+      </w:r>
+      <w:r>
+        <w:t xml:space="preserve"> → credenciales por defecto.</w:t>
+      </w:r>
+    </w:p>
+    <w:p>
+      <w:pPr>
+        <w:pStyle w:val="NormalWeb"/>
+        <w:numPr>
+          <w:ilvl w:val="2"/>
+          <w:numId w:val="10"/>
+        </w:numPr>
+      </w:pPr>
+      <w:proofErr w:type="spellStart"/>
+      <w:r>
+        <w:rPr>
+          <w:rStyle w:val="CdigoHTML"/>
+        </w:rPr>
+        <w:t>ports</w:t>
+      </w:r>
+      <w:proofErr w:type="spellEnd"/>
+      <w:r>
+        <w:rPr>
+          <w:rStyle w:val="CdigoHTML"/>
+        </w:rPr>
+        <w:t>: "5433:5432"</w:t>
+      </w:r>
+      <w:r>
+        <w:t xml:space="preserve"> → accedes desde tu máquina en el puerto </w:t>
+      </w:r>
+      <w:r>
+        <w:rPr>
+          <w:rStyle w:val="Textoennegrita"/>
+        </w:rPr>
+        <w:t>5433</w:t>
+      </w:r>
+      <w:r>
+        <w:t xml:space="preserve"> (el contenedor escucha en el </w:t>
+      </w:r>
+      <w:r>
+        <w:rPr>
+          <w:rStyle w:val="Textoennegrita"/>
+        </w:rPr>
+        <w:t>5432</w:t>
+      </w:r>
+      <w:r>
+        <w:t xml:space="preserve"> interno).</w:t>
+      </w:r>
+    </w:p>
+    <w:p>
+      <w:pPr>
+        <w:pStyle w:val="NormalWeb"/>
+        <w:numPr>
+          <w:ilvl w:val="2"/>
+          <w:numId w:val="10"/>
+        </w:numPr>
+      </w:pPr>
+      <w:proofErr w:type="spellStart"/>
+      <w:r>
+        <w:rPr>
+          <w:rStyle w:val="CdigoHTML"/>
+        </w:rPr>
+        <w:t>volumes</w:t>
+      </w:r>
+      <w:proofErr w:type="spellEnd"/>
+      <w:r>
+        <w:t>:</w:t>
+      </w:r>
+    </w:p>
+    <w:p>
+      <w:pPr>
+        <w:pStyle w:val="NormalWeb"/>
+        <w:numPr>
+          <w:ilvl w:val="2"/>
+          <w:numId w:val="10"/>
+        </w:numPr>
+      </w:pPr>
+      <w:proofErr w:type="spellStart"/>
+      <w:r>
+        <w:rPr>
+          <w:rStyle w:val="CdigoHTML"/>
+        </w:rPr>
+        <w:t>postgres_data</w:t>
+      </w:r>
+      <w:proofErr w:type="spellEnd"/>
+      <w:r>
+        <w:t xml:space="preserve"> → guarda los datos de la BD en tu host (persistencia).</w:t>
+      </w:r>
+    </w:p>
+    <w:p>
+      <w:pPr>
+        <w:pStyle w:val="NormalWeb"/>
+        <w:numPr>
+          <w:ilvl w:val="2"/>
+          <w:numId w:val="10"/>
+        </w:numPr>
+      </w:pPr>
+      <w:r>
+        <w:rPr>
+          <w:rStyle w:val="CdigoHTML"/>
+        </w:rPr>
+        <w:t>/home/</w:t>
+      </w:r>
+      <w:proofErr w:type="spellStart"/>
+      <w:r>
+        <w:rPr>
+          <w:rStyle w:val="CdigoHTML"/>
+        </w:rPr>
+        <w:t>ubuntu</w:t>
+      </w:r>
+      <w:proofErr w:type="spellEnd"/>
+      <w:r>
+        <w:rPr>
+          <w:rStyle w:val="CdigoHTML"/>
+        </w:rPr>
+        <w:t>/</w:t>
+      </w:r>
+      <w:proofErr w:type="spellStart"/>
+      <w:r>
+        <w:rPr>
+          <w:rStyle w:val="CdigoHTML"/>
+        </w:rPr>
+        <w:t>db_backups</w:t>
+      </w:r>
+      <w:proofErr w:type="spellEnd"/>
+      <w:r>
+        <w:rPr>
+          <w:rStyle w:val="CdigoHTML"/>
+        </w:rPr>
+        <w:t>:/</w:t>
+      </w:r>
+      <w:proofErr w:type="spellStart"/>
+      <w:r>
+        <w:rPr>
+          <w:rStyle w:val="CdigoHTML"/>
+        </w:rPr>
+        <w:t>backups</w:t>
+      </w:r>
+      <w:proofErr w:type="spellEnd"/>
+      <w:r>
+        <w:rPr>
+          <w:rStyle w:val="CdigoHTML"/>
+        </w:rPr>
+        <w:t>/</w:t>
+      </w:r>
+      <w:proofErr w:type="spellStart"/>
+      <w:r>
+        <w:rPr>
+          <w:rStyle w:val="CdigoHTML"/>
+        </w:rPr>
+        <w:t>postgres</w:t>
+      </w:r>
+      <w:proofErr w:type="spellEnd"/>
+      <w:r>
+        <w:t xml:space="preserve"> → carpeta para respaldos en tu servidor.</w:t>
+      </w:r>
+    </w:p>
+    <w:p>
+      <w:pPr>
+        <w:pStyle w:val="NormalWeb"/>
+        <w:numPr>
+          <w:ilvl w:val="2"/>
+          <w:numId w:val="10"/>
+        </w:numPr>
+      </w:pPr>
+      <w:proofErr w:type="spellStart"/>
+      <w:r>
+        <w:rPr>
+          <w:rStyle w:val="CdigoHTML"/>
+        </w:rPr>
+        <w:t>healthcheck</w:t>
+      </w:r>
+      <w:proofErr w:type="spellEnd"/>
+      <w:r>
+        <w:t xml:space="preserve"> → verifica que PostgreSQL esté corriendo antes de que otros servicios dependan de él.</w:t>
+      </w:r>
+    </w:p>
+    <w:p>
+      <w:pPr>
+        <w:pStyle w:val="NormalWeb"/>
+        <w:numPr>
+          <w:ilvl w:val="2"/>
+          <w:numId w:val="10"/>
+        </w:numPr>
+      </w:pPr>
+      <w:proofErr w:type="spellStart"/>
+      <w:r>
+        <w:rPr>
+          <w:rStyle w:val="CdigoHTML"/>
+          <w:rFonts w:eastAsiaTheme="minorEastAsia"/>
+        </w:rPr>
+        <w:t>labels</w:t>
+      </w:r>
+      <w:proofErr w:type="spellEnd"/>
+      <w:r>
+        <w:t xml:space="preserve"> → simple </w:t>
+      </w:r>
+      <w:proofErr w:type="spellStart"/>
+      <w:r>
+        <w:t>metadata</w:t>
+      </w:r>
+      <w:proofErr w:type="spellEnd"/>
+      <w:r>
+        <w:t xml:space="preserve"> para organizar.</w:t>
+      </w:r>
+    </w:p>
+    <w:p>
+      <w:pPr>
+        <w:pStyle w:val="Ttulo1"/>
+        <w:rPr>
+          <w:lang w:val="es-CO"/>
+        </w:rPr>
+      </w:pPr>
+      <w:r>
+        <w:rPr>
+          <w:lang w:val="es-CO"/>
+        </w:rPr>
+        <w:t>3. Guía práctica de despliegue</w:t>
+      </w:r>
+    </w:p>
+    <w:p>
+      <w:pPr>
+        <w:pStyle w:val="Prrafodelista"/>
+        <w:numPr>
+          <w:ilvl w:val="0"/>
+          <w:numId w:val="14"/>
+        </w:numPr>
+        <w:rPr>
+          <w:lang w:val="es-CO"/>
+        </w:rPr>
+      </w:pPr>
+      <w:r>
+        <w:rPr>
+          <w:lang w:val="es-CO"/>
+        </w:rPr>
+        <w:t>Clonar el repositorio del mismo GitHub.</w:t>
+      </w:r>
+    </w:p>
+    <w:p>
+      <w:pPr>
+        <w:pStyle w:val="Prrafodelista"/>
+        <w:numPr>
+          <w:ilvl w:val="0"/>
+          <w:numId w:val="14"/>
+        </w:numPr>
+        <w:rPr>
+          <w:lang w:val="es-CO"/>
+        </w:rPr>
+      </w:pPr>
+      <w:r>
+        <w:rPr>
+          <w:lang w:val="es-CO"/>
+        </w:rPr>
+        <w:t>Tener instalado Docker y WSL.</w:t>
+      </w:r>
+    </w:p>
+    <w:p>
+      <w:pPr>
+        <w:pStyle w:val="Prrafodelista"/>
+        <w:numPr>
+          <w:ilvl w:val="0"/>
+          <w:numId w:val="14"/>
+        </w:numPr>
+        <w:rPr>
+          <w:lang w:val="es-CO"/>
+        </w:rPr>
+      </w:pPr>
+      <w:r>
+        <w:rPr>
+          <w:lang w:val="es-CO"/>
+        </w:rPr>
+        <w:t>Entrar a el editor Visual Studio Code.</w:t>
+      </w:r>
+    </w:p>
+    <w:p>
+      <w:pPr>
+        <w:pStyle w:val="Prrafodelista"/>
+        <w:numPr>
+          <w:ilvl w:val="0"/>
+          <w:numId w:val="14"/>
+        </w:numPr>
+        <w:rPr>
+          <w:lang w:val="es-CO"/>
+        </w:rPr>
+      </w:pPr>
+      <w:r>
+        <w:rPr>
+          <w:lang w:val="es-CO"/>
+        </w:rPr>
+        <w:t>Entrar desde el editor de código a la carpeta correspondiente.</w:t>
+      </w:r>
+    </w:p>
+    <w:p>
+      <w:pPr>
+        <w:pStyle w:val="Prrafodelista"/>
+        <w:numPr>
+          <w:ilvl w:val="0"/>
+          <w:numId w:val="14"/>
+        </w:numPr>
+        <w:rPr>
+          <w:lang w:val="es-CO"/>
+        </w:rPr>
+      </w:pPr>
+      <w:r>
+        <w:rPr>
+          <w:lang w:val="es-CO"/>
+        </w:rPr>
+        <w:t xml:space="preserve">Entrar a la carpeta </w:t>
+      </w:r>
+      <w:proofErr w:type="spellStart"/>
+      <w:r>
+        <w:rPr>
+          <w:lang w:val="es-CO"/>
+        </w:rPr>
+        <w:t>Postgres</w:t>
+      </w:r>
+      <w:proofErr w:type="spellEnd"/>
+      <w:r>
+        <w:rPr>
+          <w:lang w:val="es-CO"/>
+        </w:rPr>
+        <w:t xml:space="preserve"> alojada en la dirección week4-&gt;sesión 2-&gt;material-&gt;</w:t>
+      </w:r>
+      <w:proofErr w:type="spellStart"/>
+      <w:r>
+        <w:rPr>
+          <w:lang w:val="es-CO"/>
+        </w:rPr>
+        <w:t>architecture</w:t>
+      </w:r>
+      <w:proofErr w:type="spellEnd"/>
+      <w:r>
+        <w:rPr>
+          <w:lang w:val="es-CO"/>
+        </w:rPr>
+        <w:t>-&gt;</w:t>
+      </w:r>
+      <w:proofErr w:type="spellStart"/>
+      <w:r>
+        <w:rPr>
+          <w:lang w:val="es-CO"/>
+        </w:rPr>
+        <w:t>devop</w:t>
+      </w:r>
+      <w:proofErr w:type="spellEnd"/>
+      <w:r>
+        <w:rPr>
+          <w:lang w:val="es-CO"/>
+        </w:rPr>
+        <w:t>.</w:t>
+      </w:r>
+    </w:p>
+    <w:p>
+      <w:pPr>
+        <w:pStyle w:val="Prrafodelista"/>
+        <w:numPr>
+          <w:ilvl w:val="0"/>
+          <w:numId w:val="14"/>
+        </w:numPr>
+        <w:rPr>
+          <w:lang w:val="es-CO"/>
+        </w:rPr>
+      </w:pPr>
+      <w:r>
+        <w:rPr>
+          <w:lang w:val="es-CO"/>
+        </w:rPr>
+        <w:t>Ejecutar el archivo “Docker-</w:t>
+      </w:r>
+      <w:proofErr w:type="spellStart"/>
+      <w:r>
+        <w:rPr>
+          <w:lang w:val="es-CO"/>
+        </w:rPr>
+        <w:t>compose.yml</w:t>
+      </w:r>
+      <w:proofErr w:type="spellEnd"/>
+      <w:r>
+        <w:rPr>
+          <w:lang w:val="es-CO"/>
+        </w:rPr>
+        <w:t>” con la extensión:</w:t>
+      </w:r>
+      <w:r>
+        <w:rPr>
+          <w:lang w:val="es-CO"/>
+        </w:rPr>
+        <w:t xml:space="preserve"> </w:t>
+      </w:r>
+      <w:r>
+        <w:rPr>
+          <w:noProof/>
+          <w:lang w:val="es-CO"/>
+        </w:rPr>
+        <w:drawing>
+          <wp:inline distT="0" distB="0" distL="0" distR="0" wp14:anchorId="732BCFE6" wp14:editId="72D39E04">
+            <wp:extent cx="3696216" cy="847843"/>
+            <wp:effectExtent l="0" t="0" r="0" b="9525"/>
+            <wp:docPr id="5" name="Imagen 5"/>
+            <wp:cNvGraphicFramePr>
+              <a:graphicFrameLocks xmlns:a="http://schemas.openxmlformats.org/drawingml/2006/main" noChangeAspect="1"/>
+            </wp:cNvGraphicFramePr>
+            <a:graphic xmlns:a="http://schemas.openxmlformats.org/drawingml/2006/main">
+              <a:graphicData uri="http://schemas.openxmlformats.org/drawingml/2006/picture">
+                <pic:pic xmlns:pic="http://schemas.openxmlformats.org/drawingml/2006/picture">
+                  <pic:nvPicPr>
+                    <pic:cNvPr id="1" name=""/>
+                    <pic:cNvPicPr/>
+                  </pic:nvPicPr>
+                  <pic:blipFill>
+                    <a:blip r:embed="rId11"/>
+                    <a:stretch>
+                      <a:fillRect/>
+                    </a:stretch>
+                  </pic:blipFill>
+                  <pic:spPr>
+                    <a:xfrm>
+                      <a:off x="0" y="0"/>
                       <a:ext cx="3696216" cy="847843"/>
                     </a:xfrm>
                     <a:prstGeom prst="rect">
@@ -1227,20 +1279,22 @@
       </w:pPr>
       <w:r>
         <w:rPr>
-          <w:lang w:val="es-CO"/>
-        </w:rPr>
+          <w:noProof/>
+          <w:lang w:val="es-CO"/>
+        </w:rPr>
+        <w:lastRenderedPageBreak/>
         <mc:AlternateContent>
           <mc:Choice Requires="wps">
             <w:drawing>
-              <wp:anchor distT="0" distB="0" distL="114300" distR="114300" simplePos="0" relativeHeight="251656704" behindDoc="0" locked="0" layoutInCell="1" allowOverlap="1" wp14:anchorId="4AAEADD4" wp14:editId="094D69BF">
+              <wp:anchor distT="0" distB="0" distL="114300" distR="114300" simplePos="0" relativeHeight="251656704" behindDoc="0" locked="0" layoutInCell="1" allowOverlap="1" wp14:anchorId="4AAEADD4" wp14:editId="71C33291">
                 <wp:simplePos x="0" y="0"/>
                 <wp:positionH relativeFrom="column">
-                  <wp:posOffset>645289</wp:posOffset>
+                  <wp:posOffset>450850</wp:posOffset>
                 </wp:positionH>
                 <wp:positionV relativeFrom="paragraph">
-                  <wp:posOffset>584522</wp:posOffset>
+                  <wp:posOffset>6985</wp:posOffset>
                 </wp:positionV>
-                <wp:extent cx="1360025" cy="231164"/>
+                <wp:extent cx="1360025" cy="383540"/>
                 <wp:effectExtent l="0" t="0" r="12065" b="16510"/>
                 <wp:wrapNone/>
                 <wp:docPr id="7" name="Elipse 7"/>
@@ -1252,7 +1306,7 @@
                       <wps:spPr>
                         <a:xfrm>
                           <a:off x="0" y="0"/>
-                          <a:ext cx="1360025" cy="231164"/>
+                          <a:ext cx="1360025" cy="383540"/>
                         </a:xfrm>
                         <a:prstGeom prst="ellipse">
                           <a:avLst/>
@@ -1299,700 +1353,21 @@
           </mc:Choice>
           <mc:Fallback>
             <w:pict>
-              <v:oval w14:anchorId="6D2920DA" id="Elipse 7" o:spid="_x0000_s1026" style="position:absolute;margin-left:50.8pt;margin-top:46.05pt;width:107.1pt;height:18.2pt;z-index:251656704;visibility:visible;mso-wrap-style:square;mso-height-percent:0;mso-wrap-distance-left:9pt;mso-wrap-distance-top:0;mso-wrap-distance-right:9pt;mso-wrap-distance-bottom:0;mso-position-horizontal:absolute;mso-position-horizontal-relative:text;mso-position-vertical:absolute;mso-position-vertical-relative:text;mso-height-percent:0;mso-height-relative:margin;v-text-anchor:middle" o:gfxdata="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" filled="f" strokecolor="#c0504d [3205]"/>
+              <v:oval w14:anchorId="6DE80824" id="Elipse 7" o:spid="_x0000_s1026" style="position:absolute;margin-left:35.5pt;margin-top:.55pt;width:107.1pt;height:30.2pt;z-index:251656704;visibility:visible;mso-wrap-style:square;mso-height-percent:0;mso-wrap-distance-left:9pt;mso-wrap-distance-top:0;mso-wrap-distance-right:9pt;mso-wrap-distance-bottom:0;mso-position-horizontal:absolute;mso-position-horizontal-relative:text;mso-position-vertical:absolute;mso-position-vertical-relative:text;mso-height-percent:0;mso-height-relative:margin;v-text-anchor:middle" o:gfxdata="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" filled="f" strokecolor="#c0504d [3205]"/>
             </w:pict>
           </mc:Fallback>
         </mc:AlternateContent>
       </w:r>
       <w:r>
         <w:rPr>
+          <w:noProof/>
           <w:lang w:val="es-CO"/>
         </w:rPr>
         <w:drawing>
-          <wp:inline distT="0" distB="0" distL="0" distR="0" wp14:anchorId="03E2B81F" wp14:editId="2BBE41F9">
-            <wp:extent cx="4163006" cy="1933845"/>
-            <wp:effectExtent l="0" t="0" r="9525" b="9525"/>
-            <wp:docPr id="6" name="Imagen 6"/>
-            <wp:cNvGraphicFramePr>
-              <a:graphicFrameLocks xmlns:a="http://schemas.openxmlformats.org/drawingml/2006/main" noChangeAspect="1"/>
-            </wp:cNvGraphicFramePr>
-            <a:graphic xmlns:a="http://schemas.openxmlformats.org/drawingml/2006/main">
-              <a:graphicData uri="http://schemas.openxmlformats.org/drawingml/2006/picture">
-                <pic:pic xmlns:pic="http://schemas.openxmlformats.org/drawingml/2006/picture">
-                  <pic:nvPicPr>
-                    <pic:cNvPr id="1" name=""/>
-                    <pic:cNvPicPr/>
-                  </pic:nvPicPr>
-                  <pic:blipFill>
-                    <a:blip r:embed="rId11"/>
-                    <a:stretch>
-                      <a:fillRect/>
-                    </a:stretch>
-                  </pic:blipFill>
-                  <pic:spPr>
-                    <a:xfrm>
-                      <a:off x="0" y="0"/>
-                      <a:ext cx="4163006" cy="1933845"/>
-                    </a:xfrm>
-                    <a:prstGeom prst="rect">
-                      <a:avLst/>
-                    </a:prstGeom>
-                  </pic:spPr>
-                </pic:pic>
-              </a:graphicData>
-            </a:graphic>
-          </wp:inline>
-        </w:drawing>
-      </w:r>
-    </w:p>
-    <w:p>
-      <w:pPr>
-        <w:pStyle w:val="Prrafodelista"/>
-        <w:numPr>
-          <w:ilvl w:val="0"/>
-          <w:numId w:val="14"/>
-        </w:numPr>
-        <w:rPr>
-          <w:lang w:val="es-CO"/>
-        </w:rPr>
-      </w:pPr>
-      <w:r>
-        <w:rPr>
-          <w:lang w:val="es-CO"/>
-        </w:rPr>
-        <w:t>Configurar el Docker con las entidades usadas con terminal:</w:t>
-      </w:r>
-      <w:r>
-        <w:rPr>
-          <w:rFonts w:ascii="Noto Sans" w:hAnsi="Noto Sans" w:cs="Noto Sans"/>
-          <w:lang w:val="es-CO"/>
-        </w:rPr>
-        <w:t xml:space="preserve"> </w:t>
-      </w:r>
-    </w:p>
-    <w:p>
-      <w:pPr>
-        <w:pStyle w:val="Prrafodelista"/>
-        <w:rPr>
-          <w:lang w:val="es-CO"/>
-        </w:rPr>
-      </w:pPr>
-      <w:r>
-        <w:rPr>
-          <w:rFonts w:ascii="Noto Sans" w:hAnsi="Noto Sans" w:cs="Noto Sans"/>
-          <w:lang w:val="es-CO"/>
-        </w:rPr>
-        <w:t>Primero:</w:t>
-      </w:r>
-    </w:p>
-    <w:p>
-      <w:pPr>
-        <w:pStyle w:val="Prrafodelista"/>
-        <w:rPr>
-          <w:rFonts w:ascii="Noto Sans" w:hAnsi="Noto Sans" w:cs="Noto Sans"/>
-          <w:lang w:val="es-CO"/>
-        </w:rPr>
-      </w:pPr>
-      <w:proofErr w:type="spellStart"/>
-      <w:r>
-        <w:rPr>
-          <w:rFonts w:ascii="Noto Sans" w:hAnsi="Noto Sans" w:cs="Noto Sans"/>
-          <w:lang w:val="es-CO"/>
-        </w:rPr>
-        <w:lastRenderedPageBreak/>
-        <w:t>docker</w:t>
-      </w:r>
-      <w:proofErr w:type="spellEnd"/>
-      <w:r>
-        <w:rPr>
-          <w:rFonts w:ascii="Noto Sans" w:hAnsi="Noto Sans" w:cs="Noto Sans"/>
-          <w:lang w:val="es-CO"/>
-        </w:rPr>
-        <w:t xml:space="preserve"> </w:t>
-      </w:r>
-      <w:proofErr w:type="spellStart"/>
-      <w:r>
-        <w:rPr>
-          <w:rFonts w:ascii="Noto Sans" w:hAnsi="Noto Sans" w:cs="Noto Sans"/>
-          <w:lang w:val="es-CO"/>
-        </w:rPr>
-        <w:t>exec</w:t>
-      </w:r>
-      <w:proofErr w:type="spellEnd"/>
-      <w:r>
-        <w:rPr>
-          <w:rFonts w:ascii="Noto Sans" w:hAnsi="Noto Sans" w:cs="Noto Sans"/>
-          <w:lang w:val="es-CO"/>
-        </w:rPr>
-        <w:t xml:space="preserve"> -</w:t>
-      </w:r>
-      <w:proofErr w:type="spellStart"/>
-      <w:r>
-        <w:rPr>
-          <w:rFonts w:ascii="Noto Sans" w:hAnsi="Noto Sans" w:cs="Noto Sans"/>
-          <w:lang w:val="es-CO"/>
-        </w:rPr>
-        <w:t>it</w:t>
-      </w:r>
-      <w:proofErr w:type="spellEnd"/>
-      <w:r>
-        <w:rPr>
-          <w:rFonts w:ascii="Noto Sans" w:hAnsi="Noto Sans" w:cs="Noto Sans"/>
-          <w:lang w:val="es-CO"/>
-        </w:rPr>
-        <w:t xml:space="preserve"> serve-</w:t>
-      </w:r>
-      <w:proofErr w:type="spellStart"/>
-      <w:r>
-        <w:rPr>
-          <w:rFonts w:ascii="Noto Sans" w:hAnsi="Noto Sans" w:cs="Noto Sans"/>
-          <w:lang w:val="es-CO"/>
-        </w:rPr>
-        <w:t>postgres</w:t>
-      </w:r>
-      <w:proofErr w:type="spellEnd"/>
-      <w:r>
-        <w:rPr>
-          <w:rFonts w:ascii="Noto Sans" w:hAnsi="Noto Sans" w:cs="Noto Sans"/>
-          <w:lang w:val="es-CO"/>
-        </w:rPr>
-        <w:t>-</w:t>
-      </w:r>
-      <w:proofErr w:type="spellStart"/>
-      <w:r>
-        <w:rPr>
-          <w:rFonts w:ascii="Noto Sans" w:hAnsi="Noto Sans" w:cs="Noto Sans"/>
-          <w:lang w:val="es-CO"/>
-        </w:rPr>
-        <w:t>sena</w:t>
-      </w:r>
-      <w:proofErr w:type="spellEnd"/>
-      <w:r>
-        <w:rPr>
-          <w:rFonts w:ascii="Noto Sans" w:hAnsi="Noto Sans" w:cs="Noto Sans"/>
-          <w:lang w:val="es-CO"/>
-        </w:rPr>
-        <w:t xml:space="preserve"> </w:t>
-      </w:r>
-      <w:proofErr w:type="spellStart"/>
-      <w:r>
-        <w:rPr>
-          <w:rFonts w:ascii="Noto Sans" w:hAnsi="Noto Sans" w:cs="Noto Sans"/>
-          <w:lang w:val="es-CO"/>
-        </w:rPr>
-        <w:t>psql</w:t>
-      </w:r>
-      <w:proofErr w:type="spellEnd"/>
-      <w:r>
-        <w:rPr>
-          <w:rFonts w:ascii="Noto Sans" w:hAnsi="Noto Sans" w:cs="Noto Sans"/>
-          <w:lang w:val="es-CO"/>
-        </w:rPr>
-        <w:t xml:space="preserve"> -U </w:t>
-      </w:r>
-      <w:proofErr w:type="spellStart"/>
-      <w:r>
-        <w:rPr>
-          <w:rFonts w:ascii="Noto Sans" w:hAnsi="Noto Sans" w:cs="Noto Sans"/>
-          <w:lang w:val="es-CO"/>
-        </w:rPr>
-        <w:t>postgres</w:t>
-      </w:r>
-      <w:proofErr w:type="spellEnd"/>
-      <w:r>
-        <w:rPr>
-          <w:rFonts w:ascii="Noto Sans" w:hAnsi="Noto Sans" w:cs="Noto Sans"/>
-          <w:lang w:val="es-CO"/>
-        </w:rPr>
-        <w:t xml:space="preserve"> -d </w:t>
-      </w:r>
-      <w:proofErr w:type="spellStart"/>
-      <w:r>
-        <w:rPr>
-          <w:rFonts w:ascii="Noto Sans" w:hAnsi="Noto Sans" w:cs="Noto Sans"/>
-          <w:lang w:val="es-CO"/>
-        </w:rPr>
-        <w:t>flight_management</w:t>
-      </w:r>
-      <w:proofErr w:type="spellEnd"/>
-      <w:r>
-        <w:rPr>
-          <w:rFonts w:ascii="Noto Sans" w:hAnsi="Noto Sans" w:cs="Noto Sans"/>
-          <w:lang w:val="es-CO"/>
-        </w:rPr>
-        <w:t xml:space="preserve"> </w:t>
-      </w:r>
-    </w:p>
-    <w:p>
-      <w:pPr>
-        <w:pStyle w:val="Prrafodelista"/>
-        <w:rPr>
-          <w:rFonts w:ascii="Noto Sans" w:hAnsi="Noto Sans" w:cs="Noto Sans"/>
-          <w:lang w:val="es-CO"/>
-        </w:rPr>
-      </w:pPr>
-      <w:r>
-        <w:rPr>
-          <w:rFonts w:ascii="Noto Sans" w:hAnsi="Noto Sans" w:cs="Noto Sans"/>
-          <w:lang w:val="es-CO"/>
-        </w:rPr>
-        <w:t>Luego:</w:t>
-      </w:r>
-    </w:p>
-    <w:p>
-      <w:pPr>
-        <w:pStyle w:val="Prrafodelista"/>
-        <w:rPr>
-          <w:rFonts w:ascii="Noto Sans" w:hAnsi="Noto Sans" w:cs="Noto Sans"/>
-          <w:lang w:val="es-CO"/>
-        </w:rPr>
-      </w:pPr>
-      <w:r>
-        <w:rPr>
-          <w:rFonts w:ascii="Noto Sans" w:hAnsi="Noto Sans" w:cs="Noto Sans"/>
-          <w:lang w:val="es-CO"/>
-        </w:rPr>
-        <w:t xml:space="preserve">CREATE SCHEMA </w:t>
-      </w:r>
-      <w:proofErr w:type="spellStart"/>
-      <w:r>
-        <w:rPr>
-          <w:rFonts w:ascii="Noto Sans" w:hAnsi="Noto Sans" w:cs="Noto Sans"/>
-          <w:lang w:val="es-CO"/>
-        </w:rPr>
-        <w:t>aircraft_management</w:t>
-      </w:r>
-      <w:proofErr w:type="spellEnd"/>
-      <w:r>
-        <w:rPr>
-          <w:rFonts w:ascii="Noto Sans" w:hAnsi="Noto Sans" w:cs="Noto Sans"/>
-          <w:lang w:val="es-CO"/>
-        </w:rPr>
-        <w:t>;</w:t>
-      </w:r>
-    </w:p>
-    <w:p>
-      <w:pPr>
-        <w:pStyle w:val="Prrafodelista"/>
-        <w:rPr>
-          <w:rFonts w:ascii="Noto Sans" w:hAnsi="Noto Sans" w:cs="Noto Sans"/>
-          <w:lang w:val="es-CO"/>
-        </w:rPr>
-      </w:pPr>
-      <w:r>
-        <w:rPr>
-          <w:rFonts w:ascii="Noto Sans" w:hAnsi="Noto Sans" w:cs="Noto Sans"/>
-          <w:lang w:val="es-CO"/>
-        </w:rPr>
-        <w:t xml:space="preserve">CREATE SCHEMA </w:t>
-      </w:r>
-      <w:proofErr w:type="spellStart"/>
-      <w:r>
-        <w:rPr>
-          <w:rFonts w:ascii="Noto Sans" w:hAnsi="Noto Sans" w:cs="Noto Sans"/>
-          <w:lang w:val="es-CO"/>
-        </w:rPr>
-        <w:t>flight</w:t>
-      </w:r>
-      <w:proofErr w:type="spellEnd"/>
-      <w:r>
-        <w:rPr>
-          <w:rFonts w:ascii="Noto Sans" w:hAnsi="Noto Sans" w:cs="Noto Sans"/>
-          <w:lang w:val="es-CO"/>
-        </w:rPr>
-        <w:t xml:space="preserve">; </w:t>
-      </w:r>
-    </w:p>
-    <w:p>
-      <w:pPr>
-        <w:pStyle w:val="Prrafodelista"/>
-        <w:rPr>
-          <w:rFonts w:ascii="Noto Sans" w:hAnsi="Noto Sans" w:cs="Noto Sans"/>
-          <w:lang w:val="es-CO"/>
-        </w:rPr>
-      </w:pPr>
-      <w:r>
-        <w:rPr>
-          <w:rFonts w:ascii="Noto Sans" w:hAnsi="Noto Sans" w:cs="Noto Sans"/>
-          <w:lang w:val="es-CO"/>
-        </w:rPr>
-        <w:t xml:space="preserve">CREATE SCHEMA </w:t>
-      </w:r>
-      <w:proofErr w:type="spellStart"/>
-      <w:r>
-        <w:rPr>
-          <w:rFonts w:ascii="Noto Sans" w:hAnsi="Noto Sans" w:cs="Noto Sans"/>
-          <w:lang w:val="es-CO"/>
-        </w:rPr>
-        <w:t>geolocation</w:t>
-      </w:r>
-      <w:proofErr w:type="spellEnd"/>
-      <w:r>
-        <w:rPr>
-          <w:rFonts w:ascii="Noto Sans" w:hAnsi="Noto Sans" w:cs="Noto Sans"/>
-          <w:lang w:val="es-CO"/>
-        </w:rPr>
-        <w:t xml:space="preserve">; </w:t>
-      </w:r>
-    </w:p>
-    <w:p>
-      <w:pPr>
-        <w:pStyle w:val="Prrafodelista"/>
-        <w:rPr>
-          <w:rFonts w:ascii="Noto Sans" w:hAnsi="Noto Sans" w:cs="Noto Sans"/>
-          <w:lang w:val="es-CO"/>
-        </w:rPr>
-      </w:pPr>
-      <w:r>
-        <w:rPr>
-          <w:rFonts w:ascii="Noto Sans" w:hAnsi="Noto Sans" w:cs="Noto Sans"/>
-          <w:lang w:val="es-CO"/>
-        </w:rPr>
-        <w:t xml:space="preserve">CREATE SCHEMA </w:t>
-      </w:r>
-      <w:proofErr w:type="spellStart"/>
-      <w:r>
-        <w:rPr>
-          <w:rFonts w:ascii="Noto Sans" w:hAnsi="Noto Sans" w:cs="Noto Sans"/>
-          <w:lang w:val="es-CO"/>
-        </w:rPr>
-        <w:t>human_resources</w:t>
-      </w:r>
-      <w:proofErr w:type="spellEnd"/>
-      <w:r>
-        <w:rPr>
-          <w:rFonts w:ascii="Noto Sans" w:hAnsi="Noto Sans" w:cs="Noto Sans"/>
-          <w:lang w:val="es-CO"/>
-        </w:rPr>
-        <w:t xml:space="preserve">; </w:t>
-      </w:r>
-    </w:p>
-    <w:p>
-      <w:pPr>
-        <w:pStyle w:val="Prrafodelista"/>
-        <w:rPr>
-          <w:rFonts w:ascii="Noto Sans" w:hAnsi="Noto Sans" w:cs="Noto Sans"/>
-          <w:lang w:val="es-CO"/>
-        </w:rPr>
-      </w:pPr>
-      <w:r>
-        <w:rPr>
-          <w:rFonts w:ascii="Noto Sans" w:hAnsi="Noto Sans" w:cs="Noto Sans"/>
-          <w:lang w:val="es-CO"/>
-        </w:rPr>
-        <w:t xml:space="preserve">CREATE SCHEMA </w:t>
-      </w:r>
-      <w:proofErr w:type="spellStart"/>
-      <w:r>
-        <w:rPr>
-          <w:rFonts w:ascii="Noto Sans" w:hAnsi="Noto Sans" w:cs="Noto Sans"/>
-          <w:lang w:val="es-CO"/>
-        </w:rPr>
-        <w:t>infrastructure</w:t>
-      </w:r>
-      <w:proofErr w:type="spellEnd"/>
-      <w:r>
-        <w:rPr>
-          <w:rFonts w:ascii="Noto Sans" w:hAnsi="Noto Sans" w:cs="Noto Sans"/>
-          <w:lang w:val="es-CO"/>
-        </w:rPr>
-        <w:t xml:space="preserve">; </w:t>
-      </w:r>
-    </w:p>
-    <w:p>
-      <w:pPr>
-        <w:pStyle w:val="Prrafodelista"/>
-        <w:rPr>
-          <w:rFonts w:ascii="Noto Sans" w:hAnsi="Noto Sans" w:cs="Noto Sans"/>
-          <w:lang w:val="es-CO"/>
-        </w:rPr>
-      </w:pPr>
-      <w:r>
-        <w:rPr>
-          <w:rFonts w:ascii="Noto Sans" w:hAnsi="Noto Sans" w:cs="Noto Sans"/>
-          <w:lang w:val="es-CO"/>
-        </w:rPr>
-        <w:t xml:space="preserve">CREATE SCHEMA </w:t>
-      </w:r>
-      <w:proofErr w:type="spellStart"/>
-      <w:r>
-        <w:rPr>
-          <w:rFonts w:ascii="Noto Sans" w:hAnsi="Noto Sans" w:cs="Noto Sans"/>
-          <w:lang w:val="es-CO"/>
-        </w:rPr>
-        <w:t>notification</w:t>
-      </w:r>
-      <w:proofErr w:type="spellEnd"/>
-      <w:r>
-        <w:rPr>
-          <w:rFonts w:ascii="Noto Sans" w:hAnsi="Noto Sans" w:cs="Noto Sans"/>
-          <w:lang w:val="es-CO"/>
-        </w:rPr>
-        <w:t xml:space="preserve">; </w:t>
-      </w:r>
-    </w:p>
-    <w:p>
-      <w:pPr>
-        <w:pStyle w:val="Prrafodelista"/>
-        <w:rPr>
-          <w:rFonts w:ascii="Noto Sans" w:hAnsi="Noto Sans" w:cs="Noto Sans"/>
-          <w:lang w:val="es-CO"/>
-        </w:rPr>
-      </w:pPr>
-      <w:r>
-        <w:rPr>
-          <w:rFonts w:ascii="Noto Sans" w:hAnsi="Noto Sans" w:cs="Noto Sans"/>
-          <w:lang w:val="es-CO"/>
-        </w:rPr>
-        <w:t xml:space="preserve">CREATE SCHEMA </w:t>
-      </w:r>
-      <w:proofErr w:type="spellStart"/>
-      <w:r>
-        <w:rPr>
-          <w:rFonts w:ascii="Noto Sans" w:hAnsi="Noto Sans" w:cs="Noto Sans"/>
-          <w:lang w:val="es-CO"/>
-        </w:rPr>
-        <w:t>parameterization</w:t>
-      </w:r>
-      <w:proofErr w:type="spellEnd"/>
-      <w:r>
-        <w:rPr>
-          <w:rFonts w:ascii="Noto Sans" w:hAnsi="Noto Sans" w:cs="Noto Sans"/>
-          <w:lang w:val="es-CO"/>
-        </w:rPr>
-        <w:t xml:space="preserve">; </w:t>
-      </w:r>
-    </w:p>
-    <w:p>
-      <w:pPr>
-        <w:pStyle w:val="Prrafodelista"/>
-        <w:rPr>
-          <w:rFonts w:ascii="Noto Sans" w:hAnsi="Noto Sans" w:cs="Noto Sans"/>
-          <w:lang w:val="es-CO"/>
-        </w:rPr>
-      </w:pPr>
-      <w:r>
-        <w:rPr>
-          <w:rFonts w:ascii="Noto Sans" w:hAnsi="Noto Sans" w:cs="Noto Sans"/>
-          <w:lang w:val="es-CO"/>
-        </w:rPr>
-        <w:t xml:space="preserve">CREATE SCHEMA </w:t>
-      </w:r>
-      <w:proofErr w:type="spellStart"/>
-      <w:r>
-        <w:rPr>
-          <w:rFonts w:ascii="Noto Sans" w:hAnsi="Noto Sans" w:cs="Noto Sans"/>
-          <w:lang w:val="es-CO"/>
-        </w:rPr>
-        <w:t>passengersServices</w:t>
-      </w:r>
-      <w:proofErr w:type="spellEnd"/>
-      <w:r>
-        <w:rPr>
-          <w:rFonts w:ascii="Noto Sans" w:hAnsi="Noto Sans" w:cs="Noto Sans"/>
-          <w:lang w:val="es-CO"/>
-        </w:rPr>
-        <w:t xml:space="preserve">; </w:t>
-      </w:r>
-    </w:p>
-    <w:p>
-      <w:pPr>
-        <w:pStyle w:val="Prrafodelista"/>
-        <w:rPr>
-          <w:rFonts w:ascii="Noto Sans" w:hAnsi="Noto Sans" w:cs="Noto Sans"/>
-          <w:lang w:val="es-CO"/>
-        </w:rPr>
-      </w:pPr>
-      <w:r>
-        <w:rPr>
-          <w:rFonts w:ascii="Noto Sans" w:hAnsi="Noto Sans" w:cs="Noto Sans"/>
-          <w:lang w:val="es-CO"/>
-        </w:rPr>
-        <w:t xml:space="preserve">CREATE SCHEMA </w:t>
-      </w:r>
-      <w:proofErr w:type="spellStart"/>
-      <w:r>
-        <w:rPr>
-          <w:rFonts w:ascii="Noto Sans" w:hAnsi="Noto Sans" w:cs="Noto Sans"/>
-          <w:lang w:val="es-CO"/>
-        </w:rPr>
-        <w:t>security</w:t>
-      </w:r>
-      <w:proofErr w:type="spellEnd"/>
-      <w:r>
-        <w:rPr>
-          <w:rFonts w:ascii="Noto Sans" w:hAnsi="Noto Sans" w:cs="Noto Sans"/>
-          <w:lang w:val="es-CO"/>
-        </w:rPr>
-        <w:t>;</w:t>
-      </w:r>
-    </w:p>
-    <w:p>
-      <w:pPr>
-        <w:pStyle w:val="Prrafodelista"/>
-        <w:rPr>
-          <w:rFonts w:ascii="Noto Sans" w:hAnsi="Noto Sans" w:cs="Noto Sans"/>
-          <w:lang w:val="es-CO"/>
-        </w:rPr>
-      </w:pPr>
-      <w:r>
-        <w:rPr>
-          <w:rFonts w:ascii="Noto Sans" w:hAnsi="Noto Sans" w:cs="Noto Sans"/>
-          <w:lang w:val="es-CO"/>
-        </w:rPr>
-        <w:t xml:space="preserve">Esto se hace para crear cada entidad y que el </w:t>
-      </w:r>
-      <w:proofErr w:type="spellStart"/>
-      <w:r>
-        <w:rPr>
-          <w:rFonts w:ascii="Noto Sans" w:hAnsi="Noto Sans" w:cs="Noto Sans"/>
-          <w:lang w:val="es-CO"/>
-        </w:rPr>
-        <w:t>Backend</w:t>
-      </w:r>
-      <w:proofErr w:type="spellEnd"/>
-      <w:r>
-        <w:rPr>
-          <w:rFonts w:ascii="Noto Sans" w:hAnsi="Noto Sans" w:cs="Noto Sans"/>
-          <w:lang w:val="es-CO"/>
-        </w:rPr>
-        <w:t xml:space="preserve"> pueda trabajar con normalidad.</w:t>
-      </w:r>
-    </w:p>
-    <w:p>
-      <w:pPr>
-        <w:pStyle w:val="Prrafodelista"/>
-        <w:numPr>
-          <w:ilvl w:val="0"/>
-          <w:numId w:val="14"/>
-        </w:numPr>
-        <w:rPr>
-          <w:lang w:val="es-CO"/>
-        </w:rPr>
-      </w:pPr>
-      <w:r>
-        <w:rPr>
-          <w:lang w:val="es-CO"/>
-        </w:rPr>
-        <mc:AlternateContent>
-          <mc:Choice Requires="wps">
-            <w:drawing>
-              <wp:anchor distT="0" distB="0" distL="114300" distR="114300" simplePos="0" relativeHeight="251657728" behindDoc="0" locked="0" layoutInCell="1" allowOverlap="1" wp14:anchorId="7FDC207B" wp14:editId="680CCCBA">
-                <wp:simplePos x="0" y="0"/>
-                <wp:positionH relativeFrom="column">
-                  <wp:posOffset>3660140</wp:posOffset>
-                </wp:positionH>
-                <wp:positionV relativeFrom="paragraph">
-                  <wp:posOffset>1323790</wp:posOffset>
-                </wp:positionV>
-                <wp:extent cx="1811438" cy="1099595"/>
-                <wp:effectExtent l="0" t="0" r="17780" b="24765"/>
-                <wp:wrapNone/>
-                <wp:docPr id="10" name="Elipse 10"/>
-                <wp:cNvGraphicFramePr/>
-                <a:graphic xmlns:a="http://schemas.openxmlformats.org/drawingml/2006/main">
-                  <a:graphicData uri="http://schemas.microsoft.com/office/word/2010/wordprocessingShape">
-                    <wps:wsp>
-                      <wps:cNvSpPr/>
-                      <wps:spPr>
-                        <a:xfrm>
-                          <a:off x="0" y="0"/>
-                          <a:ext cx="1811438" cy="1099595"/>
-                        </a:xfrm>
-                        <a:prstGeom prst="ellipse">
-                          <a:avLst/>
-                        </a:prstGeom>
-                        <a:noFill/>
-                        <a:ln w="9525" cap="flat" cmpd="sng" algn="ctr">
-                          <a:solidFill>
-                            <a:schemeClr val="accent2"/>
-                          </a:solidFill>
-                          <a:prstDash val="solid"/>
-                          <a:round/>
-                          <a:headEnd type="none" w="med" len="med"/>
-                          <a:tailEnd type="none" w="med" len="med"/>
-                        </a:ln>
-                      </wps:spPr>
-                      <wps:style>
-                        <a:lnRef idx="0">
-                          <a:scrgbClr r="0" g="0" b="0"/>
-                        </a:lnRef>
-                        <a:fillRef idx="0">
-                          <a:scrgbClr r="0" g="0" b="0"/>
-                        </a:fillRef>
-                        <a:effectRef idx="0">
-                          <a:scrgbClr r="0" g="0" b="0"/>
-                        </a:effectRef>
-                        <a:fontRef idx="minor">
-                          <a:schemeClr val="accent2"/>
-                        </a:fontRef>
-                      </wps:style>
-                      <wps:bodyPr rot="0" spcFirstLastPara="0" vertOverflow="overflow" horzOverflow="overflow" vert="horz" wrap="square" lIns="91440" tIns="45720" rIns="91440" bIns="45720" numCol="1" spcCol="0" rtlCol="0" fromWordArt="0" anchor="ctr" anchorCtr="0" forceAA="0" compatLnSpc="1">
-                        <a:prstTxWarp prst="textNoShape">
-                          <a:avLst/>
-                        </a:prstTxWarp>
-                        <a:noAutofit/>
-                      </wps:bodyPr>
-                    </wps:wsp>
-                  </a:graphicData>
-                </a:graphic>
-                <wp14:sizeRelH relativeFrom="margin">
-                  <wp14:pctWidth>0</wp14:pctWidth>
-                </wp14:sizeRelH>
-                <wp14:sizeRelV relativeFrom="margin">
-                  <wp14:pctHeight>0</wp14:pctHeight>
-                </wp14:sizeRelV>
-              </wp:anchor>
-            </w:drawing>
-          </mc:Choice>
-          <mc:Fallback>
-            <w:pict>
-              <v:oval w14:anchorId="41025E42" id="Elipse 10" o:spid="_x0000_s1026" style="position:absolute;margin-left:288.2pt;margin-top:104.25pt;width:142.65pt;height:86.6pt;z-index:251657728;visibility:visible;mso-wrap-style:square;mso-width-percent:0;mso-height-percent:0;mso-wrap-distance-left:9pt;mso-wrap-distance-top:0;mso-wrap-distance-right:9pt;mso-wrap-distance-bottom:0;mso-position-horizontal:absolute;mso-position-horizontal-relative:text;mso-position-vertical:absolute;mso-position-vertical-relative:text;mso-width-percent:0;mso-height-percent:0;mso-width-relative:margin;mso-height-relative:margin;v-text-anchor:middle" o:gfxdata="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" filled="f" strokecolor="#c0504d [3205]"/>
-            </w:pict>
-          </mc:Fallback>
-        </mc:AlternateContent>
-      </w:r>
-      <w:r>
-        <w:rPr>
-          <w:lang w:val="es-CO"/>
-        </w:rPr>
-        <w:t xml:space="preserve">Ejecutar el </w:t>
-      </w:r>
-      <w:proofErr w:type="spellStart"/>
-      <w:r>
-        <w:rPr>
-          <w:lang w:val="es-CO"/>
-        </w:rPr>
-        <w:t>Backend</w:t>
-      </w:r>
-      <w:proofErr w:type="spellEnd"/>
-      <w:r>
-        <w:rPr>
-          <w:lang w:val="es-CO"/>
-        </w:rPr>
-        <w:t xml:space="preserve"> por medio del editor de código teniendo </w:t>
-      </w:r>
-      <w:r>
-        <w:rPr>
-          <w:lang w:val="es-CO"/>
-        </w:rPr>
-        <w:t>esta extensión</w:t>
-      </w:r>
-      <w:r>
-        <w:rPr>
-          <w:noProof/>
-        </w:rPr>
-        <w:t xml:space="preserve"> </w:t>
-      </w:r>
-      <w:r>
-        <w:rPr>
-          <w:lang w:val="es-CO"/>
-        </w:rPr>
-        <w:drawing>
-          <wp:inline distT="0" distB="0" distL="0" distR="0" wp14:anchorId="28D87BCD" wp14:editId="58F719CD">
-            <wp:extent cx="5486400" cy="908685"/>
-            <wp:effectExtent l="0" t="0" r="0" b="5715"/>
-            <wp:docPr id="8" name="Imagen 8"/>
+          <wp:inline distT="0" distB="0" distL="0" distR="0" wp14:anchorId="4EE4A7B5" wp14:editId="3502A63E">
+            <wp:extent cx="3486637" cy="1676634"/>
+            <wp:effectExtent l="0" t="0" r="0" b="0"/>
+            <wp:docPr id="13" name="Imagen 13"/>
             <wp:cNvGraphicFramePr>
               <a:graphicFrameLocks xmlns:a="http://schemas.openxmlformats.org/drawingml/2006/main" noChangeAspect="1"/>
             </wp:cNvGraphicFramePr>
@@ -2012,7 +1387,7 @@
                   <pic:spPr>
                     <a:xfrm>
                       <a:off x="0" y="0"/>
-                      <a:ext cx="5486400" cy="908685"/>
+                      <a:ext cx="3486637" cy="1676634"/>
                     </a:xfrm>
                     <a:prstGeom prst="rect">
                       <a:avLst/>
@@ -2024,52 +1399,6 @@
           </wp:inline>
         </w:drawing>
       </w:r>
-      <w:r>
-        <w:rPr>
-          <w:noProof/>
-        </w:rPr>
-        <w:t xml:space="preserve"> </w:t>
-      </w:r>
-      <w:r>
-        <w:rPr>
-          <w:noProof/>
-        </w:rPr>
-        <w:drawing>
-          <wp:inline distT="0" distB="0" distL="0" distR="0" wp14:anchorId="6628A568" wp14:editId="7D43AB1E">
-            <wp:extent cx="5486400" cy="1543050"/>
-            <wp:effectExtent l="0" t="0" r="0" b="0"/>
-            <wp:docPr id="9" name="Imagen 9"/>
-            <wp:cNvGraphicFramePr>
-              <a:graphicFrameLocks xmlns:a="http://schemas.openxmlformats.org/drawingml/2006/main" noChangeAspect="1"/>
-            </wp:cNvGraphicFramePr>
-            <a:graphic xmlns:a="http://schemas.openxmlformats.org/drawingml/2006/main">
-              <a:graphicData uri="http://schemas.openxmlformats.org/drawingml/2006/picture">
-                <pic:pic xmlns:pic="http://schemas.openxmlformats.org/drawingml/2006/picture">
-                  <pic:nvPicPr>
-                    <pic:cNvPr id="1" name=""/>
-                    <pic:cNvPicPr/>
-                  </pic:nvPicPr>
-                  <pic:blipFill>
-                    <a:blip r:embed="rId13"/>
-                    <a:stretch>
-                      <a:fillRect/>
-                    </a:stretch>
-                  </pic:blipFill>
-                  <pic:spPr>
-                    <a:xfrm>
-                      <a:off x="0" y="0"/>
-                      <a:ext cx="5486400" cy="1543050"/>
-                    </a:xfrm>
-                    <a:prstGeom prst="rect">
-                      <a:avLst/>
-                    </a:prstGeom>
-                  </pic:spPr>
-                </pic:pic>
-              </a:graphicData>
-            </a:graphic>
-          </wp:inline>
-        </w:drawing>
-      </w:r>
     </w:p>
     <w:p>
       <w:pPr>
@@ -2086,71 +1415,533 @@
         <w:rPr>
           <w:lang w:val="es-CO"/>
         </w:rPr>
+        <w:t>Configurar el Docker con las entidades usadas con terminal:</w:t>
+      </w:r>
+      <w:r>
+        <w:rPr>
+          <w:rFonts w:ascii="Noto Sans" w:hAnsi="Noto Sans" w:cs="Noto Sans"/>
+          <w:lang w:val="es-CO"/>
+        </w:rPr>
+        <w:t xml:space="preserve"> </w:t>
+      </w:r>
+    </w:p>
+    <w:p>
+      <w:pPr>
+        <w:pStyle w:val="Prrafodelista"/>
+        <w:rPr>
+          <w:lang w:val="es-CO"/>
+        </w:rPr>
+      </w:pPr>
+      <w:r>
+        <w:rPr>
+          <w:rFonts w:ascii="Noto Sans" w:hAnsi="Noto Sans" w:cs="Noto Sans"/>
+          <w:lang w:val="es-CO"/>
+        </w:rPr>
+        <w:t>Primero:</w:t>
+      </w:r>
+    </w:p>
+    <w:p>
+      <w:pPr>
+        <w:pStyle w:val="Prrafodelista"/>
+        <w:rPr>
+          <w:rFonts w:ascii="Noto Sans" w:hAnsi="Noto Sans" w:cs="Noto Sans"/>
+          <w:lang w:val="es-CO"/>
+        </w:rPr>
+      </w:pPr>
+      <w:proofErr w:type="spellStart"/>
+      <w:r>
+        <w:rPr>
+          <w:rFonts w:ascii="Noto Sans" w:hAnsi="Noto Sans" w:cs="Noto Sans"/>
+          <w:lang w:val="es-CO"/>
+        </w:rPr>
+        <w:t>docker</w:t>
+      </w:r>
+      <w:proofErr w:type="spellEnd"/>
+      <w:r>
+        <w:rPr>
+          <w:rFonts w:ascii="Noto Sans" w:hAnsi="Noto Sans" w:cs="Noto Sans"/>
+          <w:lang w:val="es-CO"/>
+        </w:rPr>
+        <w:t xml:space="preserve"> </w:t>
+      </w:r>
+      <w:proofErr w:type="spellStart"/>
+      <w:r>
+        <w:rPr>
+          <w:rFonts w:ascii="Noto Sans" w:hAnsi="Noto Sans" w:cs="Noto Sans"/>
+          <w:lang w:val="es-CO"/>
+        </w:rPr>
+        <w:t>exec</w:t>
+      </w:r>
+      <w:proofErr w:type="spellEnd"/>
+      <w:r>
+        <w:rPr>
+          <w:rFonts w:ascii="Noto Sans" w:hAnsi="Noto Sans" w:cs="Noto Sans"/>
+          <w:lang w:val="es-CO"/>
+        </w:rPr>
+        <w:t xml:space="preserve"> -</w:t>
+      </w:r>
+      <w:proofErr w:type="spellStart"/>
+      <w:r>
+        <w:rPr>
+          <w:rFonts w:ascii="Noto Sans" w:hAnsi="Noto Sans" w:cs="Noto Sans"/>
+          <w:lang w:val="es-CO"/>
+        </w:rPr>
+        <w:t>it</w:t>
+      </w:r>
+      <w:proofErr w:type="spellEnd"/>
+      <w:r>
+        <w:rPr>
+          <w:rFonts w:ascii="Noto Sans" w:hAnsi="Noto Sans" w:cs="Noto Sans"/>
+          <w:lang w:val="es-CO"/>
+        </w:rPr>
+        <w:t xml:space="preserve"> serve-</w:t>
+      </w:r>
+      <w:proofErr w:type="spellStart"/>
+      <w:r>
+        <w:rPr>
+          <w:rFonts w:ascii="Noto Sans" w:hAnsi="Noto Sans" w:cs="Noto Sans"/>
+          <w:lang w:val="es-CO"/>
+        </w:rPr>
+        <w:t>postgres</w:t>
+      </w:r>
+      <w:proofErr w:type="spellEnd"/>
+      <w:r>
+        <w:rPr>
+          <w:rFonts w:ascii="Noto Sans" w:hAnsi="Noto Sans" w:cs="Noto Sans"/>
+          <w:lang w:val="es-CO"/>
+        </w:rPr>
+        <w:t>-</w:t>
+      </w:r>
+      <w:proofErr w:type="spellStart"/>
+      <w:r>
+        <w:rPr>
+          <w:rFonts w:ascii="Noto Sans" w:hAnsi="Noto Sans" w:cs="Noto Sans"/>
+          <w:lang w:val="es-CO"/>
+        </w:rPr>
+        <w:t>sena</w:t>
+      </w:r>
+      <w:proofErr w:type="spellEnd"/>
+      <w:r>
+        <w:rPr>
+          <w:rFonts w:ascii="Noto Sans" w:hAnsi="Noto Sans" w:cs="Noto Sans"/>
+          <w:lang w:val="es-CO"/>
+        </w:rPr>
+        <w:t xml:space="preserve"> </w:t>
+      </w:r>
+      <w:proofErr w:type="spellStart"/>
+      <w:r>
+        <w:rPr>
+          <w:rFonts w:ascii="Noto Sans" w:hAnsi="Noto Sans" w:cs="Noto Sans"/>
+          <w:lang w:val="es-CO"/>
+        </w:rPr>
+        <w:t>psql</w:t>
+      </w:r>
+      <w:proofErr w:type="spellEnd"/>
+      <w:r>
+        <w:rPr>
+          <w:rFonts w:ascii="Noto Sans" w:hAnsi="Noto Sans" w:cs="Noto Sans"/>
+          <w:lang w:val="es-CO"/>
+        </w:rPr>
+        <w:t xml:space="preserve"> -U </w:t>
+      </w:r>
+      <w:proofErr w:type="spellStart"/>
+      <w:r>
+        <w:rPr>
+          <w:rFonts w:ascii="Noto Sans" w:hAnsi="Noto Sans" w:cs="Noto Sans"/>
+          <w:lang w:val="es-CO"/>
+        </w:rPr>
+        <w:t>postgres</w:t>
+      </w:r>
+      <w:proofErr w:type="spellEnd"/>
+      <w:r>
+        <w:rPr>
+          <w:rFonts w:ascii="Noto Sans" w:hAnsi="Noto Sans" w:cs="Noto Sans"/>
+          <w:lang w:val="es-CO"/>
+        </w:rPr>
+        <w:t xml:space="preserve"> -d </w:t>
+      </w:r>
+      <w:proofErr w:type="spellStart"/>
+      <w:r>
+        <w:rPr>
+          <w:rFonts w:ascii="Noto Sans" w:hAnsi="Noto Sans" w:cs="Noto Sans"/>
+          <w:lang w:val="es-CO"/>
+        </w:rPr>
+        <w:t>flight_management</w:t>
+      </w:r>
+      <w:proofErr w:type="spellEnd"/>
+      <w:r>
+        <w:rPr>
+          <w:rFonts w:ascii="Noto Sans" w:hAnsi="Noto Sans" w:cs="Noto Sans"/>
+          <w:lang w:val="es-CO"/>
+        </w:rPr>
+        <w:t xml:space="preserve"> </w:t>
+      </w:r>
+    </w:p>
+    <w:p>
+      <w:pPr>
+        <w:pStyle w:val="Prrafodelista"/>
+        <w:rPr>
+          <w:rFonts w:ascii="Noto Sans" w:hAnsi="Noto Sans" w:cs="Noto Sans"/>
+          <w:lang w:val="es-CO"/>
+        </w:rPr>
+      </w:pPr>
+      <w:r>
+        <w:rPr>
+          <w:rFonts w:ascii="Noto Sans" w:hAnsi="Noto Sans" w:cs="Noto Sans"/>
+          <w:lang w:val="es-CO"/>
+        </w:rPr>
+        <w:t>Luego:</w:t>
+      </w:r>
+    </w:p>
+    <w:p>
+      <w:pPr>
+        <w:pStyle w:val="Prrafodelista"/>
+        <w:rPr>
+          <w:rFonts w:ascii="Noto Sans" w:hAnsi="Noto Sans" w:cs="Noto Sans"/>
+          <w:lang w:val="es-CO"/>
+        </w:rPr>
+      </w:pPr>
+      <w:r>
+        <w:rPr>
+          <w:rFonts w:ascii="Noto Sans" w:hAnsi="Noto Sans" w:cs="Noto Sans"/>
+          <w:lang w:val="es-CO"/>
+        </w:rPr>
+        <w:t xml:space="preserve">CREATE SCHEMA </w:t>
+      </w:r>
+      <w:proofErr w:type="spellStart"/>
+      <w:r>
+        <w:rPr>
+          <w:rFonts w:ascii="Noto Sans" w:hAnsi="Noto Sans" w:cs="Noto Sans"/>
+          <w:lang w:val="es-CO"/>
+        </w:rPr>
+        <w:t>aircraft_management</w:t>
+      </w:r>
+      <w:proofErr w:type="spellEnd"/>
+      <w:r>
+        <w:rPr>
+          <w:rFonts w:ascii="Noto Sans" w:hAnsi="Noto Sans" w:cs="Noto Sans"/>
+          <w:lang w:val="es-CO"/>
+        </w:rPr>
+        <w:t>;</w:t>
+      </w:r>
+    </w:p>
+    <w:p>
+      <w:pPr>
+        <w:pStyle w:val="Prrafodelista"/>
+        <w:rPr>
+          <w:rFonts w:ascii="Noto Sans" w:hAnsi="Noto Sans" w:cs="Noto Sans"/>
+          <w:lang w:val="es-CO"/>
+        </w:rPr>
+      </w:pPr>
+      <w:r>
+        <w:rPr>
+          <w:rFonts w:ascii="Noto Sans" w:hAnsi="Noto Sans" w:cs="Noto Sans"/>
+          <w:lang w:val="es-CO"/>
+        </w:rPr>
+        <w:t xml:space="preserve">CREATE SCHEMA </w:t>
+      </w:r>
+      <w:proofErr w:type="spellStart"/>
+      <w:r>
+        <w:rPr>
+          <w:rFonts w:ascii="Noto Sans" w:hAnsi="Noto Sans" w:cs="Noto Sans"/>
+          <w:lang w:val="es-CO"/>
+        </w:rPr>
+        <w:t>flight</w:t>
+      </w:r>
+      <w:proofErr w:type="spellEnd"/>
+      <w:r>
+        <w:rPr>
+          <w:rFonts w:ascii="Noto Sans" w:hAnsi="Noto Sans" w:cs="Noto Sans"/>
+          <w:lang w:val="es-CO"/>
+        </w:rPr>
+        <w:t xml:space="preserve">; </w:t>
+      </w:r>
+    </w:p>
+    <w:p>
+      <w:pPr>
+        <w:pStyle w:val="Prrafodelista"/>
+        <w:rPr>
+          <w:rFonts w:ascii="Noto Sans" w:hAnsi="Noto Sans" w:cs="Noto Sans"/>
+          <w:lang w:val="es-CO"/>
+        </w:rPr>
+      </w:pPr>
+      <w:r>
+        <w:rPr>
+          <w:rFonts w:ascii="Noto Sans" w:hAnsi="Noto Sans" w:cs="Noto Sans"/>
+          <w:lang w:val="es-CO"/>
+        </w:rPr>
+        <w:t xml:space="preserve">CREATE SCHEMA </w:t>
+      </w:r>
+      <w:proofErr w:type="spellStart"/>
+      <w:r>
+        <w:rPr>
+          <w:rFonts w:ascii="Noto Sans" w:hAnsi="Noto Sans" w:cs="Noto Sans"/>
+          <w:lang w:val="es-CO"/>
+        </w:rPr>
+        <w:t>geolocation</w:t>
+      </w:r>
+      <w:proofErr w:type="spellEnd"/>
+      <w:r>
+        <w:rPr>
+          <w:rFonts w:ascii="Noto Sans" w:hAnsi="Noto Sans" w:cs="Noto Sans"/>
+          <w:lang w:val="es-CO"/>
+        </w:rPr>
+        <w:t xml:space="preserve">; </w:t>
+      </w:r>
+    </w:p>
+    <w:p>
+      <w:pPr>
+        <w:pStyle w:val="Prrafodelista"/>
+        <w:rPr>
+          <w:rFonts w:ascii="Noto Sans" w:hAnsi="Noto Sans" w:cs="Noto Sans"/>
+          <w:lang w:val="es-CO"/>
+        </w:rPr>
+      </w:pPr>
+      <w:r>
+        <w:rPr>
+          <w:rFonts w:ascii="Noto Sans" w:hAnsi="Noto Sans" w:cs="Noto Sans"/>
+          <w:lang w:val="es-CO"/>
+        </w:rPr>
+        <w:t xml:space="preserve">CREATE SCHEMA </w:t>
+      </w:r>
+      <w:proofErr w:type="spellStart"/>
+      <w:r>
+        <w:rPr>
+          <w:rFonts w:ascii="Noto Sans" w:hAnsi="Noto Sans" w:cs="Noto Sans"/>
+          <w:lang w:val="es-CO"/>
+        </w:rPr>
+        <w:t>human_resources</w:t>
+      </w:r>
+      <w:proofErr w:type="spellEnd"/>
+      <w:r>
+        <w:rPr>
+          <w:rFonts w:ascii="Noto Sans" w:hAnsi="Noto Sans" w:cs="Noto Sans"/>
+          <w:lang w:val="es-CO"/>
+        </w:rPr>
+        <w:t xml:space="preserve">; </w:t>
+      </w:r>
+    </w:p>
+    <w:p>
+      <w:pPr>
+        <w:pStyle w:val="Prrafodelista"/>
+        <w:rPr>
+          <w:rFonts w:ascii="Noto Sans" w:hAnsi="Noto Sans" w:cs="Noto Sans"/>
+          <w:lang w:val="es-CO"/>
+        </w:rPr>
+      </w:pPr>
+      <w:r>
+        <w:rPr>
+          <w:rFonts w:ascii="Noto Sans" w:hAnsi="Noto Sans" w:cs="Noto Sans"/>
+          <w:lang w:val="es-CO"/>
+        </w:rPr>
+        <w:t xml:space="preserve">CREATE SCHEMA </w:t>
+      </w:r>
+      <w:proofErr w:type="spellStart"/>
+      <w:r>
+        <w:rPr>
+          <w:rFonts w:ascii="Noto Sans" w:hAnsi="Noto Sans" w:cs="Noto Sans"/>
+          <w:lang w:val="es-CO"/>
+        </w:rPr>
+        <w:t>infrastructure</w:t>
+      </w:r>
+      <w:proofErr w:type="spellEnd"/>
+      <w:r>
+        <w:rPr>
+          <w:rFonts w:ascii="Noto Sans" w:hAnsi="Noto Sans" w:cs="Noto Sans"/>
+          <w:lang w:val="es-CO"/>
+        </w:rPr>
+        <w:t xml:space="preserve">; </w:t>
+      </w:r>
+    </w:p>
+    <w:p>
+      <w:pPr>
+        <w:pStyle w:val="Prrafodelista"/>
+        <w:rPr>
+          <w:rFonts w:ascii="Noto Sans" w:hAnsi="Noto Sans" w:cs="Noto Sans"/>
+          <w:lang w:val="es-CO"/>
+        </w:rPr>
+      </w:pPr>
+      <w:r>
+        <w:rPr>
+          <w:rFonts w:ascii="Noto Sans" w:hAnsi="Noto Sans" w:cs="Noto Sans"/>
+          <w:lang w:val="es-CO"/>
+        </w:rPr>
+        <w:t xml:space="preserve">CREATE SCHEMA </w:t>
+      </w:r>
+      <w:proofErr w:type="spellStart"/>
+      <w:r>
+        <w:rPr>
+          <w:rFonts w:ascii="Noto Sans" w:hAnsi="Noto Sans" w:cs="Noto Sans"/>
+          <w:lang w:val="es-CO"/>
+        </w:rPr>
+        <w:t>notification</w:t>
+      </w:r>
+      <w:proofErr w:type="spellEnd"/>
+      <w:r>
+        <w:rPr>
+          <w:rFonts w:ascii="Noto Sans" w:hAnsi="Noto Sans" w:cs="Noto Sans"/>
+          <w:lang w:val="es-CO"/>
+        </w:rPr>
+        <w:t xml:space="preserve">; </w:t>
+      </w:r>
+    </w:p>
+    <w:p>
+      <w:pPr>
+        <w:pStyle w:val="Prrafodelista"/>
+        <w:rPr>
+          <w:rFonts w:ascii="Noto Sans" w:hAnsi="Noto Sans" w:cs="Noto Sans"/>
+          <w:lang w:val="es-CO"/>
+        </w:rPr>
+      </w:pPr>
+      <w:r>
+        <w:rPr>
+          <w:rFonts w:ascii="Noto Sans" w:hAnsi="Noto Sans" w:cs="Noto Sans"/>
+          <w:lang w:val="es-CO"/>
+        </w:rPr>
+        <w:t xml:space="preserve">CREATE SCHEMA </w:t>
+      </w:r>
+      <w:proofErr w:type="spellStart"/>
+      <w:r>
+        <w:rPr>
+          <w:rFonts w:ascii="Noto Sans" w:hAnsi="Noto Sans" w:cs="Noto Sans"/>
+          <w:lang w:val="es-CO"/>
+        </w:rPr>
+        <w:t>parameterization</w:t>
+      </w:r>
+      <w:proofErr w:type="spellEnd"/>
+      <w:r>
+        <w:rPr>
+          <w:rFonts w:ascii="Noto Sans" w:hAnsi="Noto Sans" w:cs="Noto Sans"/>
+          <w:lang w:val="es-CO"/>
+        </w:rPr>
+        <w:t xml:space="preserve">; </w:t>
+      </w:r>
+    </w:p>
+    <w:p>
+      <w:pPr>
+        <w:pStyle w:val="Prrafodelista"/>
+        <w:rPr>
+          <w:rFonts w:ascii="Noto Sans" w:hAnsi="Noto Sans" w:cs="Noto Sans"/>
+          <w:lang w:val="es-CO"/>
+        </w:rPr>
+      </w:pPr>
+      <w:r>
+        <w:rPr>
+          <w:rFonts w:ascii="Noto Sans" w:hAnsi="Noto Sans" w:cs="Noto Sans"/>
+          <w:lang w:val="es-CO"/>
+        </w:rPr>
+        <w:t xml:space="preserve">CREATE SCHEMA </w:t>
+      </w:r>
+      <w:proofErr w:type="spellStart"/>
+      <w:r>
+        <w:rPr>
+          <w:rFonts w:ascii="Noto Sans" w:hAnsi="Noto Sans" w:cs="Noto Sans"/>
+          <w:lang w:val="es-CO"/>
+        </w:rPr>
+        <w:t>passengersServices</w:t>
+      </w:r>
+      <w:proofErr w:type="spellEnd"/>
+      <w:r>
+        <w:rPr>
+          <w:rFonts w:ascii="Noto Sans" w:hAnsi="Noto Sans" w:cs="Noto Sans"/>
+          <w:lang w:val="es-CO"/>
+        </w:rPr>
+        <w:t xml:space="preserve">; </w:t>
+      </w:r>
+    </w:p>
+    <w:p>
+      <w:pPr>
+        <w:pStyle w:val="Prrafodelista"/>
+        <w:rPr>
+          <w:rFonts w:ascii="Noto Sans" w:hAnsi="Noto Sans" w:cs="Noto Sans"/>
+          <w:lang w:val="es-CO"/>
+        </w:rPr>
+      </w:pPr>
+      <w:r>
+        <w:rPr>
+          <w:rFonts w:ascii="Noto Sans" w:hAnsi="Noto Sans" w:cs="Noto Sans"/>
+          <w:lang w:val="es-CO"/>
+        </w:rPr>
+        <w:t xml:space="preserve">CREATE SCHEMA </w:t>
+      </w:r>
+      <w:proofErr w:type="spellStart"/>
+      <w:r>
+        <w:rPr>
+          <w:rFonts w:ascii="Noto Sans" w:hAnsi="Noto Sans" w:cs="Noto Sans"/>
+          <w:lang w:val="es-CO"/>
+        </w:rPr>
+        <w:t>security</w:t>
+      </w:r>
+      <w:proofErr w:type="spellEnd"/>
+      <w:r>
+        <w:rPr>
+          <w:rFonts w:ascii="Noto Sans" w:hAnsi="Noto Sans" w:cs="Noto Sans"/>
+          <w:lang w:val="es-CO"/>
+        </w:rPr>
+        <w:t>;</w:t>
+      </w:r>
+    </w:p>
+    <w:p>
+      <w:pPr>
+        <w:pStyle w:val="Prrafodelista"/>
+        <w:rPr>
+          <w:rFonts w:ascii="Noto Sans" w:hAnsi="Noto Sans" w:cs="Noto Sans"/>
+          <w:lang w:val="es-CO"/>
+        </w:rPr>
+      </w:pPr>
+      <w:r>
+        <w:rPr>
+          <w:rFonts w:ascii="Noto Sans" w:hAnsi="Noto Sans" w:cs="Noto Sans"/>
+          <w:lang w:val="es-CO"/>
+        </w:rPr>
+        <w:t xml:space="preserve">Esto se hace para crear cada entidad y que el </w:t>
+      </w:r>
+      <w:proofErr w:type="spellStart"/>
+      <w:r>
+        <w:rPr>
+          <w:rFonts w:ascii="Noto Sans" w:hAnsi="Noto Sans" w:cs="Noto Sans"/>
+          <w:lang w:val="es-CO"/>
+        </w:rPr>
+        <w:t>Backend</w:t>
+      </w:r>
+      <w:proofErr w:type="spellEnd"/>
+      <w:r>
+        <w:rPr>
+          <w:rFonts w:ascii="Noto Sans" w:hAnsi="Noto Sans" w:cs="Noto Sans"/>
+          <w:lang w:val="es-CO"/>
+        </w:rPr>
+        <w:t xml:space="preserve"> pueda trabajar con normalidad.</w:t>
+      </w:r>
+    </w:p>
+    <w:p>
+      <w:pPr>
+        <w:pStyle w:val="Prrafodelista"/>
+        <w:numPr>
+          <w:ilvl w:val="0"/>
+          <w:numId w:val="14"/>
+        </w:numPr>
+        <w:rPr>
+          <w:lang w:val="es-CO"/>
+        </w:rPr>
+      </w:pPr>
+      <w:r>
+        <w:rPr>
+          <w:lang w:val="es-CO"/>
+        </w:rPr>
         <w:t xml:space="preserve">Entrar a la dirección </w:t>
       </w:r>
-      <w:hyperlink r:id="rId14" w:anchor="/" w:tgtFrame="_blank" w:tooltip="http://localhost:9000/swagger-ui/index.html#/" w:history="1">
+      <w:hyperlink r:id="rId13" w:history="1">
         <w:r>
           <w:rPr>
             <w:rStyle w:val="Hipervnculo"/>
-            <w:rFonts w:ascii="inherit" w:hAnsi="inherit" w:cs="Noto Sans"/>
-            <w:bdr w:val="none" w:sz="0" w:space="0" w:color="auto" w:frame="1"/>
           </w:rPr>
-          <w:t>http://localhost:9000/swagger-ui/index.html#/</w:t>
+          <w:t>http://localhost:8081/swagger-ui/index.html#/</w:t>
         </w:r>
       </w:hyperlink>
-      <w:r>
-        <w:t xml:space="preserve"> </w:t>
-      </w:r>
     </w:p>
     <w:p>
       <w:pPr>
-        <w:ind w:left="360"/>
-        <w:rPr>
-          <w:lang w:val="es-CO"/>
-        </w:rPr>
-      </w:pPr>
-    </w:p>
-    <w:p>
-      <w:pPr>
         <w:pStyle w:val="Prrafodelista"/>
-        <w:rPr>
-          <w:lang w:val="es-CO"/>
-        </w:rPr>
-      </w:pPr>
-    </w:p>
-    <w:p>
-      <w:pPr>
-        <w:pStyle w:val="Prrafodelista"/>
-        <w:rPr>
-          <w:lang w:val="es-CO"/>
-        </w:rPr>
-      </w:pPr>
-    </w:p>
-    <w:p>
-      <w:pPr>
-        <w:rPr>
-          <w:rFonts w:ascii="Noto Sans" w:hAnsi="Noto Sans" w:cs="Noto Sans"/>
-          <w:lang w:val="es-CO"/>
-        </w:rPr>
-      </w:pPr>
-    </w:p>
-    <w:p>
-      <w:pPr>
-        <w:pStyle w:val="Prrafodelista"/>
-        <w:rPr>
-          <w:lang w:val="es-CO"/>
-        </w:rPr>
-      </w:pPr>
-    </w:p>
-    <w:p>
-      <w:pPr>
-        <w:rPr>
-          <w:lang w:val="es-CO"/>
-        </w:rPr>
-      </w:pPr>
-    </w:p>
-    <w:p>
-      <w:pPr>
         <w:rPr>
           <w:lang w:val="es-CO"/>
         </w:rPr>
@@ -3279,11 +3070,6 @@
     <w:lsdException w:name="Book Title" w:uiPriority="33" w:qFormat="1"/>
     <w:lsdException w:name="Bibliography" w:semiHidden="1" w:uiPriority="37" w:unhideWhenUsed="1"/>
     <w:lsdException w:name="TOC Heading" w:semiHidden="1" w:uiPriority="39" w:unhideWhenUsed="1" w:qFormat="1"/>
-    <w:lsdException w:name="Plain Table 5" w:semiHidden="1" w:unhideWhenUsed="1"/>
-    <w:lsdException w:name="Grid Table Light" w:semiHidden="1" w:unhideWhenUsed="1"/>
-    <w:lsdException w:name="Grid Table 1 Light" w:semiHidden="1" w:unhideWhenUsed="1"/>
-    <w:lsdException w:name="Grid Table 2" w:semiHidden="1" w:unhideWhenUsed="1"/>
-    <w:lsdException w:name="Grid Table 3" w:semiHidden="1" w:unhideWhenUsed="1"/>
     <w:lsdException w:name="Grid Table 4" w:uiPriority="49"/>
     <w:lsdException w:name="Grid Table 5 Dark" w:uiPriority="50"/>
     <w:lsdException w:name="Grid Table 6 Colorful" w:uiPriority="51"/>
@@ -14412,12 +14198,23 @@
     <w:name w:val="Hyperlink"/>
     <w:basedOn w:val="Fuentedeprrafopredeter"/>
     <w:uiPriority w:val="99"/>
-    <w:semiHidden/>
     <w:unhideWhenUsed/>
     <w:rsid w:val="00F91B91"/>
     <w:rPr>
       <w:color w:val="0000FF"/>
       <w:u w:val="single"/>
+    </w:rPr>
+  </w:style>
+  <w:style w:type="character" w:styleId="Mencinsinresolver">
+    <w:name w:val="Unresolved Mention"/>
+    <w:basedOn w:val="Fuentedeprrafopredeter"/>
+    <w:uiPriority w:val="99"/>
+    <w:semiHidden/>
+    <w:unhideWhenUsed/>
+    <w:rsid w:val="00733877"/>
+    <w:rPr>
+      <w:color w:val="605E5C"/>
+      <w:shd w:val="clear" w:color="auto" w:fill="E1DFDD"/>
     </w:rPr>
   </w:style>
 </w:styles>

</xml_diff>